<commit_message>
- Fix communicatin between all microservices - Fix app  properties files - Add unit Test, Integration Tests and e2e Test
</commit_message>
<xml_diff>
--- a/documentation/GWatcho-MicroService-App.docx
+++ b/documentation/GWatcho-MicroService-App.docx
@@ -431,6 +431,51 @@
     <w:p>
       <w:pPr>
         <w:rPr>
+          <w:lang w:val="en-GB"/>
+        </w:rPr>
+      </w:pPr>
+    </w:p>
+    <w:p>
+      <w:pPr>
+        <w:pStyle w:val="Listenabsatz"/>
+        <w:numPr>
+          <w:ilvl w:val="0"/>
+          <w:numId w:val="1"/>
+        </w:numPr>
+        <w:rPr>
+          <w:lang w:val="en-GB"/>
+        </w:rPr>
+      </w:pPr>
+      <w:r>
+        <w:rPr>
+          <w:lang w:val="en-GB"/>
+        </w:rPr>
+        <w:t>For single Node</w:t>
+      </w:r>
+    </w:p>
+    <w:p>
+      <w:pPr>
+        <w:rPr>
+          <w:lang w:val="en-GB"/>
+        </w:rPr>
+      </w:pPr>
+      <w:r>
+        <w:rPr>
+          <w:lang w:val="en-GB"/>
+        </w:rPr>
+        <w:t>.\bin\windows\kafka-storage.bat format --standalone -t S1oFxk8pQpmFGAnlQG5bjQ -c .\config\server.properties</w:t>
+      </w:r>
+    </w:p>
+    <w:p>
+      <w:pPr>
+        <w:rPr>
+          <w:lang w:val="en-GB"/>
+        </w:rPr>
+      </w:pPr>
+    </w:p>
+    <w:p>
+      <w:pPr>
+        <w:rPr>
           <w:b/>
           <w:bCs/>
           <w:lang w:val="en-GB"/>
@@ -677,6 +722,7 @@
         <w:rPr>
           <w:lang w:val="en-GB"/>
         </w:rPr>
+        <w:lastRenderedPageBreak/>
         <w:t xml:space="preserve">The Reconfiguration failed: No configuration found... Log4j message can be addressed separately. </w:t>
       </w:r>
       <w:r>
@@ -732,7 +778,6 @@
         <w:rPr>
           <w:lang w:val="en-GB"/>
         </w:rPr>
-        <w:lastRenderedPageBreak/>
         <w:t>Layout and Architecture</w:t>
       </w:r>
     </w:p>
@@ -744,6 +789,7 @@
       </w:pPr>
       <w:r>
         <w:rPr>
+          <w:noProof/>
           <w:lang w:val="en-GB"/>
         </w:rPr>
         <w:drawing>
@@ -762,7 +808,7 @@
                     <pic:cNvPicPr/>
                   </pic:nvPicPr>
                   <pic:blipFill>
-                    <a:blip r:embed="rId4"/>
+                    <a:blip r:embed="rId5"/>
                     <a:stretch>
                       <a:fillRect/>
                     </a:stretch>
@@ -798,6 +844,7 @@
       </w:pPr>
       <w:r>
         <w:rPr>
+          <w:noProof/>
           <w:lang w:val="en-GB"/>
         </w:rPr>
         <w:lastRenderedPageBreak/>
@@ -817,7 +864,7 @@
                     <pic:cNvPicPr/>
                   </pic:nvPicPr>
                   <pic:blipFill>
-                    <a:blip r:embed="rId5"/>
+                    <a:blip r:embed="rId6"/>
                     <a:stretch>
                       <a:fillRect/>
                     </a:stretch>
@@ -853,6 +900,7 @@
       </w:pPr>
       <w:r>
         <w:rPr>
+          <w:noProof/>
           <w:lang w:val="en-GB"/>
         </w:rPr>
         <w:lastRenderedPageBreak/>
@@ -872,7 +920,7 @@
                     <pic:cNvPicPr/>
                   </pic:nvPicPr>
                   <pic:blipFill>
-                    <a:blip r:embed="rId6"/>
+                    <a:blip r:embed="rId7"/>
                     <a:stretch>
                       <a:fillRect/>
                     </a:stretch>
@@ -908,6 +956,7 @@
       </w:pPr>
       <w:r>
         <w:rPr>
+          <w:noProof/>
           <w:lang w:val="en-GB"/>
         </w:rPr>
         <w:lastRenderedPageBreak/>
@@ -927,7 +976,7 @@
                     <pic:cNvPicPr/>
                   </pic:nvPicPr>
                   <pic:blipFill>
-                    <a:blip r:embed="rId7"/>
+                    <a:blip r:embed="rId8"/>
                     <a:stretch>
                       <a:fillRect/>
                     </a:stretch>
@@ -963,6 +1012,7 @@
       </w:pPr>
       <w:r>
         <w:rPr>
+          <w:noProof/>
           <w:lang w:val="en-GB"/>
         </w:rPr>
         <w:lastRenderedPageBreak/>
@@ -982,7 +1032,7 @@
                     <pic:cNvPicPr/>
                   </pic:nvPicPr>
                   <pic:blipFill>
-                    <a:blip r:embed="rId8"/>
+                    <a:blip r:embed="rId9"/>
                     <a:stretch>
                       <a:fillRect/>
                     </a:stretch>
@@ -1011,6 +1061,7 @@
       </w:pPr>
       <w:r>
         <w:rPr>
+          <w:noProof/>
           <w:lang w:val="en-GB"/>
         </w:rPr>
         <w:lastRenderedPageBreak/>
@@ -1030,7 +1081,7 @@
                     <pic:cNvPicPr/>
                   </pic:nvPicPr>
                   <pic:blipFill>
-                    <a:blip r:embed="rId9"/>
+                    <a:blip r:embed="rId10"/>
                     <a:stretch>
                       <a:fillRect/>
                     </a:stretch>
@@ -1066,6 +1117,7 @@
       </w:pPr>
       <w:r>
         <w:rPr>
+          <w:noProof/>
           <w:lang w:val="en-GB"/>
         </w:rPr>
         <w:lastRenderedPageBreak/>
@@ -1085,7 +1137,7 @@
                     <pic:cNvPicPr/>
                   </pic:nvPicPr>
                   <pic:blipFill>
-                    <a:blip r:embed="rId10"/>
+                    <a:blip r:embed="rId11"/>
                     <a:stretch>
                       <a:fillRect/>
                     </a:stretch>
@@ -1121,6 +1173,7 @@
       </w:pPr>
       <w:r>
         <w:rPr>
+          <w:noProof/>
           <w:lang w:val="en-GB"/>
         </w:rPr>
         <w:drawing>
@@ -1139,7 +1192,7 @@
                     <pic:cNvPicPr/>
                   </pic:nvPicPr>
                   <pic:blipFill>
-                    <a:blip r:embed="rId11"/>
+                    <a:blip r:embed="rId12"/>
                     <a:stretch>
                       <a:fillRect/>
                     </a:stretch>
@@ -1175,6 +1228,7 @@
       </w:pPr>
       <w:r>
         <w:rPr>
+          <w:noProof/>
           <w:lang w:val="en-GB"/>
         </w:rPr>
         <w:lastRenderedPageBreak/>
@@ -1194,7 +1248,7 @@
                     <pic:cNvPicPr/>
                   </pic:nvPicPr>
                   <pic:blipFill>
-                    <a:blip r:embed="rId12"/>
+                    <a:blip r:embed="rId13"/>
                     <a:stretch>
                       <a:fillRect/>
                     </a:stretch>
@@ -1223,6 +1277,126 @@
     </w:sectPr>
   </w:body>
 </w:document>
+</file>
+
+<file path=word/numbering.xml><?xml version="1.0" encoding="utf-8"?>
+<w:numbering xmlns:wpc="http://schemas.microsoft.com/office/word/2010/wordprocessingCanvas" xmlns:cx="http://schemas.microsoft.com/office/drawing/2014/chartex" xmlns:cx1="http://schemas.microsoft.com/office/drawing/2015/9/8/chartex" xmlns:cx2="http://schemas.microsoft.com/office/drawing/2015/10/21/chartex" xmlns:cx3="http://schemas.microsoft.com/office/drawing/2016/5/9/chartex" xmlns:cx4="http://schemas.microsoft.com/office/drawing/2016/5/10/chartex" xmlns:cx5="http://schemas.microsoft.com/office/drawing/2016/5/11/chartex" xmlns:cx6="http://schemas.microsoft.com/office/drawing/2016/5/12/chartex" xmlns:cx7="http://schemas.microsoft.com/office/drawing/2016/5/13/chartex" xmlns:cx8="http://schemas.microsoft.com/office/drawing/2016/5/14/chartex" xmlns:mc="http://schemas.openxmlformats.org/markup-compatibility/2006" xmlns:aink="http://schemas.microsoft.com/office/drawing/2016/ink" xmlns:am3d="http://schemas.microsoft.com/office/drawing/2017/model3d" xmlns:o="urn:schemas-microsoft-com:office:office" xmlns:oel="http://schemas.microsoft.com/office/2019/extlst" xmlns:r="http://schemas.openxmlformats.org/officeDocument/2006/relationships" xmlns:m="http://schemas.openxmlformats.org/officeDocument/2006/math" xmlns:v="urn:schemas-microsoft-com:vml" xmlns:wp14="http://schemas.microsoft.com/office/word/2010/wordprocessingDrawing" xmlns:wp="http://schemas.openxmlformats.org/drawingml/2006/wordprocessingDrawing" xmlns:w10="urn:schemas-microsoft-com:office:word" xmlns:w="http://schemas.openxmlformats.org/wordprocessingml/2006/main" xmlns:w14="http://schemas.microsoft.com/office/word/2010/wordml" xmlns:w15="http://schemas.microsoft.com/office/word/2012/wordml" xmlns:w16cex="http://schemas.microsoft.com/office/word/2018/wordml/cex" xmlns:w16cid="http://schemas.microsoft.com/office/word/2016/wordml/cid" xmlns:w16="http://schemas.microsoft.com/office/word/2018/wordml" xmlns:w16du="http://schemas.microsoft.com/office/word/2023/wordml/word16du" xmlns:w16sdtdh="http://schemas.microsoft.com/office/word/2020/wordml/sdtdatahash" xmlns:w16sdtfl="http://schemas.microsoft.com/office/word/2024/wordml/sdtformatlock" xmlns:w16se="http://schemas.microsoft.com/office/word/2015/wordml/symex" xmlns:wpg="http://schemas.microsoft.com/office/word/2010/wordprocessingGroup" xmlns:wpi="http://schemas.microsoft.com/office/word/2010/wordprocessingInk" xmlns:wne="http://schemas.microsoft.com/office/word/2006/wordml" xmlns:wps="http://schemas.microsoft.com/office/word/2010/wordprocessingShape" mc:Ignorable="w14 w15 w16se w16cid w16 w16cex w16sdtdh w16sdtfl w16du wp14">
+  <w:abstractNum w:abstractNumId="0" w15:restartNumberingAfterBreak="0">
+    <w:nsid w:val="23A225E7"/>
+    <w:multiLevelType w:val="hybridMultilevel"/>
+    <w:tmpl w:val="D318EE1C"/>
+    <w:lvl w:ilvl="0" w:tplc="C88EA78A">
+      <w:numFmt w:val="bullet"/>
+      <w:lvlText w:val="-"/>
+      <w:lvlJc w:val="left"/>
+      <w:pPr>
+        <w:ind w:left="720" w:hanging="360"/>
+      </w:pPr>
+      <w:rPr>
+        <w:rFonts w:ascii="Aptos" w:eastAsiaTheme="minorHAnsi" w:hAnsi="Aptos" w:cstheme="minorBidi" w:hint="default"/>
+      </w:rPr>
+    </w:lvl>
+    <w:lvl w:ilvl="1" w:tplc="04070003" w:tentative="1">
+      <w:start w:val="1"/>
+      <w:numFmt w:val="bullet"/>
+      <w:lvlText w:val="o"/>
+      <w:lvlJc w:val="left"/>
+      <w:pPr>
+        <w:ind w:left="1440" w:hanging="360"/>
+      </w:pPr>
+      <w:rPr>
+        <w:rFonts w:ascii="Courier New" w:hAnsi="Courier New" w:cs="Courier New" w:hint="default"/>
+      </w:rPr>
+    </w:lvl>
+    <w:lvl w:ilvl="2" w:tplc="04070005" w:tentative="1">
+      <w:start w:val="1"/>
+      <w:numFmt w:val="bullet"/>
+      <w:lvlText w:val=""/>
+      <w:lvlJc w:val="left"/>
+      <w:pPr>
+        <w:ind w:left="2160" w:hanging="360"/>
+      </w:pPr>
+      <w:rPr>
+        <w:rFonts w:ascii="Wingdings" w:hAnsi="Wingdings" w:hint="default"/>
+      </w:rPr>
+    </w:lvl>
+    <w:lvl w:ilvl="3" w:tplc="04070001" w:tentative="1">
+      <w:start w:val="1"/>
+      <w:numFmt w:val="bullet"/>
+      <w:lvlText w:val=""/>
+      <w:lvlJc w:val="left"/>
+      <w:pPr>
+        <w:ind w:left="2880" w:hanging="360"/>
+      </w:pPr>
+      <w:rPr>
+        <w:rFonts w:ascii="Symbol" w:hAnsi="Symbol" w:hint="default"/>
+      </w:rPr>
+    </w:lvl>
+    <w:lvl w:ilvl="4" w:tplc="04070003" w:tentative="1">
+      <w:start w:val="1"/>
+      <w:numFmt w:val="bullet"/>
+      <w:lvlText w:val="o"/>
+      <w:lvlJc w:val="left"/>
+      <w:pPr>
+        <w:ind w:left="3600" w:hanging="360"/>
+      </w:pPr>
+      <w:rPr>
+        <w:rFonts w:ascii="Courier New" w:hAnsi="Courier New" w:cs="Courier New" w:hint="default"/>
+      </w:rPr>
+    </w:lvl>
+    <w:lvl w:ilvl="5" w:tplc="04070005" w:tentative="1">
+      <w:start w:val="1"/>
+      <w:numFmt w:val="bullet"/>
+      <w:lvlText w:val=""/>
+      <w:lvlJc w:val="left"/>
+      <w:pPr>
+        <w:ind w:left="4320" w:hanging="360"/>
+      </w:pPr>
+      <w:rPr>
+        <w:rFonts w:ascii="Wingdings" w:hAnsi="Wingdings" w:hint="default"/>
+      </w:rPr>
+    </w:lvl>
+    <w:lvl w:ilvl="6" w:tplc="04070001" w:tentative="1">
+      <w:start w:val="1"/>
+      <w:numFmt w:val="bullet"/>
+      <w:lvlText w:val=""/>
+      <w:lvlJc w:val="left"/>
+      <w:pPr>
+        <w:ind w:left="5040" w:hanging="360"/>
+      </w:pPr>
+      <w:rPr>
+        <w:rFonts w:ascii="Symbol" w:hAnsi="Symbol" w:hint="default"/>
+      </w:rPr>
+    </w:lvl>
+    <w:lvl w:ilvl="7" w:tplc="04070003" w:tentative="1">
+      <w:start w:val="1"/>
+      <w:numFmt w:val="bullet"/>
+      <w:lvlText w:val="o"/>
+      <w:lvlJc w:val="left"/>
+      <w:pPr>
+        <w:ind w:left="5760" w:hanging="360"/>
+      </w:pPr>
+      <w:rPr>
+        <w:rFonts w:ascii="Courier New" w:hAnsi="Courier New" w:cs="Courier New" w:hint="default"/>
+      </w:rPr>
+    </w:lvl>
+    <w:lvl w:ilvl="8" w:tplc="04070005" w:tentative="1">
+      <w:start w:val="1"/>
+      <w:numFmt w:val="bullet"/>
+      <w:lvlText w:val=""/>
+      <w:lvlJc w:val="left"/>
+      <w:pPr>
+        <w:ind w:left="6480" w:hanging="360"/>
+      </w:pPr>
+      <w:rPr>
+        <w:rFonts w:ascii="Wingdings" w:hAnsi="Wingdings" w:hint="default"/>
+      </w:rPr>
+    </w:lvl>
+  </w:abstractNum>
+  <w:num w:numId="1" w16cid:durableId="970592165">
+    <w:abstractNumId w:val="0"/>
+  </w:num>
+</w:numbering>
 </file>
 
 <file path=word/styles.xml><?xml version="1.0" encoding="utf-8"?>

</xml_diff>

<commit_message>
- Add Angular front-end Application (with version 18)
</commit_message>
<xml_diff>
--- a/documentation/GWatcho-MicroService-App.docx
+++ b/documentation/GWatcho-MicroService-App.docx
@@ -79,12 +79,32 @@
           <w:lang w:val="en-GB"/>
         </w:rPr>
       </w:pPr>
-      <w:r>
-        <w:rPr>
-          <w:lang w:val="en-GB"/>
-        </w:rPr>
-        <w:t>process.roles=broker,controller</w:t>
-      </w:r>
+      <w:proofErr w:type="spellStart"/>
+      <w:proofErr w:type="gramStart"/>
+      <w:r>
+        <w:rPr>
+          <w:lang w:val="en-GB"/>
+        </w:rPr>
+        <w:t>process.roles</w:t>
+      </w:r>
+      <w:proofErr w:type="spellEnd"/>
+      <w:proofErr w:type="gramEnd"/>
+      <w:r>
+        <w:rPr>
+          <w:lang w:val="en-GB"/>
+        </w:rPr>
+        <w:t>=</w:t>
+      </w:r>
+      <w:proofErr w:type="spellStart"/>
+      <w:proofErr w:type="gramStart"/>
+      <w:r>
+        <w:rPr>
+          <w:lang w:val="en-GB"/>
+        </w:rPr>
+        <w:t>broker,controller</w:t>
+      </w:r>
+      <w:proofErr w:type="spellEnd"/>
+      <w:proofErr w:type="gramEnd"/>
     </w:p>
     <w:p>
       <w:pPr>
@@ -125,31 +145,57 @@
           <w:lang w:val="en-GB"/>
         </w:rPr>
       </w:pPr>
-      <w:r>
-        <w:rPr>
-          <w:lang w:val="en-GB"/>
-        </w:rPr>
-        <w:t>advertised.listeners=PLAINTEXT://localhost:9092</w:t>
-      </w:r>
-    </w:p>
-    <w:p>
-      <w:pPr>
-        <w:rPr>
-          <w:lang w:val="en-GB"/>
-        </w:rPr>
-      </w:pPr>
-    </w:p>
-    <w:p>
-      <w:pPr>
-        <w:rPr>
-          <w:lang w:val="en-GB"/>
-        </w:rPr>
-      </w:pPr>
-      <w:r>
-        <w:rPr>
-          <w:lang w:val="en-GB"/>
-        </w:rPr>
-        <w:t>controller.listener.names=CONTROLLER</w:t>
+      <w:proofErr w:type="spellStart"/>
+      <w:proofErr w:type="gramStart"/>
+      <w:r>
+        <w:rPr>
+          <w:lang w:val="en-GB"/>
+        </w:rPr>
+        <w:t>advertised.listeners</w:t>
+      </w:r>
+      <w:proofErr w:type="spellEnd"/>
+      <w:proofErr w:type="gramEnd"/>
+      <w:r>
+        <w:rPr>
+          <w:lang w:val="en-GB"/>
+        </w:rPr>
+        <w:t>=PLAINTEXT://localhost:9092</w:t>
+      </w:r>
+    </w:p>
+    <w:p>
+      <w:pPr>
+        <w:rPr>
+          <w:lang w:val="en-GB"/>
+        </w:rPr>
+      </w:pPr>
+    </w:p>
+    <w:p>
+      <w:pPr>
+        <w:rPr>
+          <w:lang w:val="en-GB"/>
+        </w:rPr>
+      </w:pPr>
+      <w:proofErr w:type="spellStart"/>
+      <w:proofErr w:type="gramStart"/>
+      <w:r>
+        <w:rPr>
+          <w:lang w:val="en-GB"/>
+        </w:rPr>
+        <w:t>controller.listener</w:t>
+      </w:r>
+      <w:proofErr w:type="gramEnd"/>
+      <w:r>
+        <w:rPr>
+          <w:lang w:val="en-GB"/>
+        </w:rPr>
+        <w:t>.names</w:t>
+      </w:r>
+      <w:proofErr w:type="spellEnd"/>
+      <w:r>
+        <w:rPr>
+          <w:lang w:val="en-GB"/>
+        </w:rPr>
+        <w:t>=CONTROLLER</w:t>
       </w:r>
     </w:p>
     <w:p>
@@ -167,244 +213,200 @@
     </w:p>
     <w:p>
       <w:pPr>
-        <w:rPr>
-          <w:lang w:val="en-GB"/>
-        </w:rPr>
-      </w:pPr>
-    </w:p>
-    <w:p>
-      <w:pPr>
-        <w:rPr>
-          <w:lang w:val="en-GB"/>
-        </w:rPr>
-      </w:pPr>
-      <w:r>
-        <w:rPr>
-          <w:lang w:val="en-GB"/>
-        </w:rPr>
-        <w:t>log.dirs=D:/Kafka/kafka-logs</w:t>
-      </w:r>
-    </w:p>
-    <w:p>
-      <w:pPr>
-        <w:rPr>
-          <w:lang w:val="en-GB"/>
-        </w:rPr>
-      </w:pPr>
-      <w:r>
         <w:rPr>
           <w:b/>
           <w:bCs/>
           <w:lang w:val="en-GB"/>
         </w:rPr>
-        <w:t>Do not remove other existing settings</w:t>
-      </w:r>
-      <w:r>
-        <w:rPr>
-          <w:lang w:val="en-GB"/>
-        </w:rPr>
-        <w:t xml:space="preserve"> from server.properties; just make sure these values are correct.</w:t>
-      </w:r>
-    </w:p>
-    <w:p>
-      <w:pPr>
+      </w:pPr>
+      <w:r>
         <w:rPr>
           <w:b/>
           <w:bCs/>
           <w:lang w:val="en-GB"/>
         </w:rPr>
-      </w:pPr>
+        <w:t xml:space="preserve">To reset </w:t>
+      </w:r>
+      <w:proofErr w:type="spellStart"/>
       <w:r>
         <w:rPr>
           <w:b/>
           <w:bCs/>
           <w:lang w:val="en-GB"/>
         </w:rPr>
-        <w:t>5. Important: because you already formatted Kafka</w:t>
-      </w:r>
-    </w:p>
-    <w:p>
-      <w:pPr>
-        <w:rPr>
-          <w:lang w:val="en-GB"/>
-        </w:rPr>
-      </w:pPr>
-      <w:r>
-        <w:rPr>
-          <w:lang w:val="en-GB"/>
-        </w:rPr>
-        <w:t>You already formatted the storage using:</w:t>
-      </w:r>
-    </w:p>
-    <w:p>
-      <w:pPr>
-        <w:rPr>
-          <w:lang w:val="en-GB"/>
-        </w:rPr>
-      </w:pPr>
-      <w:r>
-        <w:rPr>
-          <w:lang w:val="en-GB"/>
-        </w:rPr>
-        <w:t>3QGWer_BSuSXC0pLQB-uyA</w:t>
-      </w:r>
-    </w:p>
-    <w:p>
-      <w:pPr>
-        <w:rPr>
-          <w:lang w:val="en-GB"/>
-        </w:rPr>
-      </w:pPr>
-      <w:r>
-        <w:rPr>
-          <w:lang w:val="en-GB"/>
-        </w:rPr>
-        <w:t>and it was formatted into:</w:t>
-      </w:r>
-    </w:p>
-    <w:p>
-      <w:pPr>
-        <w:rPr>
-          <w:lang w:val="en-GB"/>
-        </w:rPr>
-      </w:pPr>
-      <w:r>
-        <w:rPr>
-          <w:lang w:val="en-GB"/>
-        </w:rPr>
-        <w:t>/tmp/kraft-combined-logs</w:t>
-      </w:r>
-    </w:p>
-    <w:p>
-      <w:pPr>
-        <w:rPr>
-          <w:lang w:val="en-GB"/>
-        </w:rPr>
-      </w:pPr>
-      <w:r>
-        <w:rPr>
-          <w:lang w:val="en-GB"/>
-        </w:rPr>
-        <w:t>If you change log.dirs to:</w:t>
-      </w:r>
-    </w:p>
-    <w:p>
-      <w:pPr>
-        <w:rPr>
-          <w:lang w:val="en-GB"/>
-        </w:rPr>
-      </w:pPr>
-      <w:r>
-        <w:rPr>
-          <w:lang w:val="en-GB"/>
-        </w:rPr>
-        <w:t>log.dirs=D:/Kafka/kafka-logs</w:t>
-      </w:r>
-    </w:p>
-    <w:p>
-      <w:pPr>
-        <w:rPr>
-          <w:lang w:val="en-GB"/>
-        </w:rPr>
-      </w:pPr>
-      <w:r>
-        <w:rPr>
-          <w:lang w:val="en-GB"/>
-        </w:rPr>
-        <w:t xml:space="preserve">you need to </w:t>
-      </w:r>
-      <w:r>
+        <w:t>kafka</w:t>
+      </w:r>
+      <w:proofErr w:type="spellEnd"/>
+    </w:p>
+    <w:p>
+      <w:pPr>
+        <w:rPr>
+          <w:lang w:val="en-GB"/>
+        </w:rPr>
+      </w:pPr>
+      <w:r>
+        <w:rPr>
+          <w:lang w:val="en-GB"/>
+        </w:rPr>
+        <w:t>Remove-Item -Recurse -</w:t>
+      </w:r>
+      <w:proofErr w:type="gramStart"/>
+      <w:r>
+        <w:rPr>
+          <w:lang w:val="en-GB"/>
+        </w:rPr>
+        <w:t>Force .</w:t>
+      </w:r>
+      <w:proofErr w:type="gramEnd"/>
+      <w:r>
+        <w:rPr>
+          <w:lang w:val="en-GB"/>
+        </w:rPr>
+        <w:t>\logs</w:t>
+      </w:r>
+    </w:p>
+    <w:p>
+      <w:pPr>
+        <w:pStyle w:val="Listenabsatz"/>
+        <w:numPr>
+          <w:ilvl w:val="0"/>
+          <w:numId w:val="2"/>
+        </w:numPr>
         <w:rPr>
           <w:b/>
           <w:bCs/>
           <w:lang w:val="en-GB"/>
         </w:rPr>
-        <w:t>format the new directory again</w:t>
-      </w:r>
-      <w:r>
-        <w:rPr>
-          <w:lang w:val="en-GB"/>
-        </w:rPr>
-        <w:t>.</w:t>
-      </w:r>
-    </w:p>
-    <w:p>
-      <w:pPr>
-        <w:rPr>
-          <w:lang w:val="en-GB"/>
-        </w:rPr>
-      </w:pPr>
-      <w:r>
-        <w:rPr>
-          <w:lang w:val="en-GB"/>
-        </w:rPr>
-        <w:t>Since this is a fresh installation with no data you need to preserve, that's fine.</w:t>
-      </w:r>
-    </w:p>
-    <w:p>
-      <w:pPr>
-        <w:rPr>
-          <w:lang w:val="en-GB"/>
-        </w:rPr>
-      </w:pPr>
-      <w:r>
-        <w:rPr>
-          <w:lang w:val="en-GB"/>
-        </w:rPr>
-        <w:t>Run:</w:t>
-      </w:r>
-    </w:p>
-    <w:p>
-      <w:pPr>
+      </w:pPr>
+      <w:r>
         <w:rPr>
           <w:b/>
           <w:bCs/>
           <w:lang w:val="en-GB"/>
         </w:rPr>
-      </w:pPr>
-      <w:r>
+        <w:t>Then generate a new cluster ID:</w:t>
+      </w:r>
+    </w:p>
+    <w:p>
+      <w:pPr>
+        <w:rPr>
+          <w:lang w:val="en-GB"/>
+        </w:rPr>
+      </w:pPr>
+      <w:r>
+        <w:rPr>
+          <w:lang w:val="en-GB"/>
+        </w:rPr>
+        <w:t>.\bin\windows\kafka-storage.bat random-</w:t>
+      </w:r>
+      <w:proofErr w:type="spellStart"/>
+      <w:r>
+        <w:rPr>
+          <w:lang w:val="en-GB"/>
+        </w:rPr>
+        <w:t>uuid</w:t>
+      </w:r>
+      <w:proofErr w:type="spellEnd"/>
+    </w:p>
+    <w:p>
+      <w:pPr>
+        <w:rPr>
+          <w:lang w:val="en-GB"/>
+        </w:rPr>
+      </w:pPr>
+      <w:r>
+        <w:rPr>
+          <w:lang w:val="en-GB"/>
+        </w:rPr>
+        <w:t>You get:</w:t>
+      </w:r>
+    </w:p>
+    <w:p>
+      <w:pPr>
+        <w:rPr>
+          <w:lang w:val="en-GB"/>
+        </w:rPr>
+      </w:pPr>
+      <w:r>
+        <w:rPr>
+          <w:lang w:val="en-GB"/>
+        </w:rPr>
+        <w:t>PS D:\Kafka\kafka-4.3.1&gt; .\bin\windows\kafka-storage.bat random-</w:t>
+      </w:r>
+      <w:proofErr w:type="spellStart"/>
+      <w:r>
+        <w:rPr>
+          <w:lang w:val="en-GB"/>
+        </w:rPr>
+        <w:t>uuid</w:t>
+      </w:r>
+      <w:proofErr w:type="spellEnd"/>
+    </w:p>
+    <w:p>
+      <w:pPr>
+        <w:rPr>
+          <w:lang w:val="en-GB"/>
+        </w:rPr>
+      </w:pPr>
+      <w:r>
+        <w:rPr>
+          <w:lang w:val="en-GB"/>
+        </w:rPr>
+        <w:t>2026-09-24T10:37:26.673732Z main ERROR Reconfiguration failed: No configuration found for '266474c2' at 'null' in 'null'</w:t>
+      </w:r>
+    </w:p>
+    <w:p>
+      <w:pPr>
         <w:rPr>
           <w:b/>
           <w:bCs/>
           <w:lang w:val="en-GB"/>
         </w:rPr>
-        <w:lastRenderedPageBreak/>
-        <w:t>New-Item -ItemType Directory -Force D:\Kafka\kafka-logs</w:t>
-      </w:r>
-    </w:p>
-    <w:p>
-      <w:pPr>
-        <w:rPr>
-          <w:lang w:val="en-GB"/>
-        </w:rPr>
-      </w:pPr>
-      <w:r>
-        <w:rPr>
-          <w:lang w:val="en-GB"/>
-        </w:rPr>
-        <w:t>Then:</w:t>
-      </w:r>
-    </w:p>
-    <w:p>
-      <w:pPr>
-        <w:rPr>
-          <w:lang w:val="en-GB"/>
-        </w:rPr>
-      </w:pPr>
-      <w:r>
-        <w:rPr>
-          <w:lang w:val="en-GB"/>
-        </w:rPr>
-        <w:t>.\bin\windows\kafka-storage.bat format --standalone -t 3QGWer_BSuSXC0pLQB-uyA -c .\config\server.properties</w:t>
-      </w:r>
-    </w:p>
-    <w:p>
-      <w:pPr>
+      </w:pPr>
+      <w:r>
         <w:rPr>
           <w:b/>
           <w:bCs/>
           <w:lang w:val="en-GB"/>
         </w:rPr>
+        <w:t>cXSMH3t3RgqIB7nQa7PMxQ</w:t>
+      </w:r>
+    </w:p>
+    <w:p>
+      <w:pPr>
+        <w:rPr>
+          <w:lang w:val="en-GB"/>
+        </w:rPr>
+      </w:pPr>
+    </w:p>
+    <w:p>
+      <w:pPr>
+        <w:rPr>
+          <w:lang w:val="en-GB"/>
+        </w:rPr>
+      </w:pPr>
+      <w:proofErr w:type="spellStart"/>
+      <w:proofErr w:type="gramStart"/>
+      <w:r>
+        <w:rPr>
+          <w:lang w:val="en-GB"/>
+        </w:rPr>
+        <w:t>log.dirs</w:t>
+      </w:r>
+      <w:proofErr w:type="spellEnd"/>
+      <w:proofErr w:type="gramEnd"/>
+      <w:r>
+        <w:rPr>
+          <w:lang w:val="en-GB"/>
+        </w:rPr>
+        <w:t>=D:/Kafka/kafka-logs</w:t>
+      </w:r>
+    </w:p>
+    <w:p>
+      <w:pPr>
+        <w:rPr>
+          <w:lang w:val="en-GB"/>
+        </w:rPr>
       </w:pPr>
       <w:r>
         <w:rPr>
@@ -412,6 +414,362 @@
           <w:bCs/>
           <w:lang w:val="en-GB"/>
         </w:rPr>
+        <w:t>Do not remove other existing settings</w:t>
+      </w:r>
+      <w:r>
+        <w:rPr>
+          <w:lang w:val="en-GB"/>
+        </w:rPr>
+        <w:t xml:space="preserve"> from </w:t>
+      </w:r>
+      <w:proofErr w:type="spellStart"/>
+      <w:proofErr w:type="gramStart"/>
+      <w:r>
+        <w:rPr>
+          <w:lang w:val="en-GB"/>
+        </w:rPr>
+        <w:t>server.properties</w:t>
+      </w:r>
+      <w:proofErr w:type="spellEnd"/>
+      <w:proofErr w:type="gramEnd"/>
+      <w:r>
+        <w:rPr>
+          <w:lang w:val="en-GB"/>
+        </w:rPr>
+        <w:t>; just make sure these values are correct.</w:t>
+      </w:r>
+    </w:p>
+    <w:p>
+      <w:pPr>
+        <w:rPr>
+          <w:b/>
+          <w:bCs/>
+          <w:lang w:val="en-GB"/>
+        </w:rPr>
+      </w:pPr>
+      <w:r>
+        <w:rPr>
+          <w:b/>
+          <w:bCs/>
+          <w:lang w:val="en-GB"/>
+        </w:rPr>
+        <w:t>5. Important: because you already formatted Kafka</w:t>
+      </w:r>
+    </w:p>
+    <w:p>
+      <w:pPr>
+        <w:rPr>
+          <w:lang w:val="en-GB"/>
+        </w:rPr>
+      </w:pPr>
+      <w:r>
+        <w:rPr>
+          <w:lang w:val="en-GB"/>
+        </w:rPr>
+        <w:lastRenderedPageBreak/>
+        <w:t>You already formatted the storage using:</w:t>
+      </w:r>
+    </w:p>
+    <w:p>
+      <w:pPr>
+        <w:rPr>
+          <w:lang w:val="en-GB"/>
+        </w:rPr>
+      </w:pPr>
+      <w:r>
+        <w:rPr>
+          <w:lang w:val="en-GB"/>
+        </w:rPr>
+        <w:t>3QGWer_BSuSXC0pLQB-uyA</w:t>
+      </w:r>
+    </w:p>
+    <w:p>
+      <w:pPr>
+        <w:rPr>
+          <w:lang w:val="en-GB"/>
+        </w:rPr>
+      </w:pPr>
+      <w:r>
+        <w:rPr>
+          <w:lang w:val="en-GB"/>
+        </w:rPr>
+        <w:t>and it was formatted into:</w:t>
+      </w:r>
+    </w:p>
+    <w:p>
+      <w:pPr>
+        <w:rPr>
+          <w:lang w:val="en-GB"/>
+        </w:rPr>
+      </w:pPr>
+      <w:r>
+        <w:rPr>
+          <w:lang w:val="en-GB"/>
+        </w:rPr>
+        <w:t>/</w:t>
+      </w:r>
+      <w:proofErr w:type="spellStart"/>
+      <w:r>
+        <w:rPr>
+          <w:lang w:val="en-GB"/>
+        </w:rPr>
+        <w:t>tmp</w:t>
+      </w:r>
+      <w:proofErr w:type="spellEnd"/>
+      <w:r>
+        <w:rPr>
+          <w:lang w:val="en-GB"/>
+        </w:rPr>
+        <w:t>/kraft-combined-logs</w:t>
+      </w:r>
+    </w:p>
+    <w:p>
+      <w:pPr>
+        <w:rPr>
+          <w:lang w:val="en-GB"/>
+        </w:rPr>
+      </w:pPr>
+      <w:r>
+        <w:rPr>
+          <w:lang w:val="en-GB"/>
+        </w:rPr>
+        <w:t xml:space="preserve">If you change </w:t>
+      </w:r>
+      <w:proofErr w:type="spellStart"/>
+      <w:proofErr w:type="gramStart"/>
+      <w:r>
+        <w:rPr>
+          <w:lang w:val="en-GB"/>
+        </w:rPr>
+        <w:t>log.dirs</w:t>
+      </w:r>
+      <w:proofErr w:type="spellEnd"/>
+      <w:proofErr w:type="gramEnd"/>
+      <w:r>
+        <w:rPr>
+          <w:lang w:val="en-GB"/>
+        </w:rPr>
+        <w:t xml:space="preserve"> to:</w:t>
+      </w:r>
+    </w:p>
+    <w:p>
+      <w:pPr>
+        <w:rPr>
+          <w:lang w:val="en-GB"/>
+        </w:rPr>
+      </w:pPr>
+      <w:proofErr w:type="spellStart"/>
+      <w:proofErr w:type="gramStart"/>
+      <w:r>
+        <w:rPr>
+          <w:lang w:val="en-GB"/>
+        </w:rPr>
+        <w:t>log.dirs</w:t>
+      </w:r>
+      <w:proofErr w:type="spellEnd"/>
+      <w:proofErr w:type="gramEnd"/>
+      <w:r>
+        <w:rPr>
+          <w:lang w:val="en-GB"/>
+        </w:rPr>
+        <w:t>=D:/Kafka/kafka-logs</w:t>
+      </w:r>
+    </w:p>
+    <w:p>
+      <w:pPr>
+        <w:rPr>
+          <w:lang w:val="en-GB"/>
+        </w:rPr>
+      </w:pPr>
+      <w:r>
+        <w:rPr>
+          <w:lang w:val="en-GB"/>
+        </w:rPr>
+        <w:t xml:space="preserve">you need to </w:t>
+      </w:r>
+      <w:r>
+        <w:rPr>
+          <w:b/>
+          <w:bCs/>
+          <w:lang w:val="en-GB"/>
+        </w:rPr>
+        <w:t>format the new directory again</w:t>
+      </w:r>
+      <w:r>
+        <w:rPr>
+          <w:lang w:val="en-GB"/>
+        </w:rPr>
+        <w:t>.</w:t>
+      </w:r>
+    </w:p>
+    <w:p>
+      <w:pPr>
+        <w:rPr>
+          <w:lang w:val="en-GB"/>
+        </w:rPr>
+      </w:pPr>
+      <w:r>
+        <w:rPr>
+          <w:lang w:val="en-GB"/>
+        </w:rPr>
+        <w:t>Since this is a fresh installation with no data you need to preserve, that's fine.</w:t>
+      </w:r>
+    </w:p>
+    <w:p>
+      <w:pPr>
+        <w:rPr>
+          <w:lang w:val="en-GB"/>
+        </w:rPr>
+      </w:pPr>
+      <w:r>
+        <w:rPr>
+          <w:lang w:val="en-GB"/>
+        </w:rPr>
+        <w:t>Run:</w:t>
+      </w:r>
+    </w:p>
+    <w:p>
+      <w:pPr>
+        <w:rPr>
+          <w:b/>
+          <w:bCs/>
+          <w:lang w:val="en-GB"/>
+        </w:rPr>
+      </w:pPr>
+      <w:r>
+        <w:rPr>
+          <w:b/>
+          <w:bCs/>
+          <w:lang w:val="en-GB"/>
+        </w:rPr>
+        <w:t xml:space="preserve">2. </w:t>
+      </w:r>
+      <w:r>
+        <w:rPr>
+          <w:b/>
+          <w:bCs/>
+          <w:lang w:val="en-GB"/>
+        </w:rPr>
+        <w:t>New-Item -ItemType Directory -Force D:\Kafka\kafka-logs</w:t>
+      </w:r>
+    </w:p>
+    <w:p>
+      <w:pPr>
+        <w:rPr>
+          <w:lang w:val="en-GB"/>
+        </w:rPr>
+      </w:pPr>
+      <w:r>
+        <w:rPr>
+          <w:lang w:val="en-GB"/>
+        </w:rPr>
+        <w:t>Then:</w:t>
+      </w:r>
+    </w:p>
+    <w:p>
+      <w:pPr>
+        <w:rPr>
+          <w:sz w:val="16"/>
+          <w:szCs w:val="16"/>
+          <w:lang w:val="en-GB"/>
+        </w:rPr>
+      </w:pPr>
+      <w:r>
+        <w:rPr>
+          <w:sz w:val="16"/>
+          <w:szCs w:val="16"/>
+          <w:lang w:val="en-GB"/>
+        </w:rPr>
+        <w:t>.\bin\windows\kafka-storage.bat format --standalone -t cXSMH3t3RgqIB7nQa7PMxQ -c .\config\</w:t>
+      </w:r>
+      <w:proofErr w:type="spellStart"/>
+      <w:r>
+        <w:rPr>
+          <w:sz w:val="16"/>
+          <w:szCs w:val="16"/>
+          <w:lang w:val="en-GB"/>
+        </w:rPr>
+        <w:t>server.properties</w:t>
+      </w:r>
+      <w:proofErr w:type="spellEnd"/>
+    </w:p>
+    <w:p>
+      <w:pPr>
+        <w:rPr>
+          <w:sz w:val="16"/>
+          <w:szCs w:val="16"/>
+          <w:lang w:val="en-GB"/>
+        </w:rPr>
+      </w:pPr>
+      <w:r>
+        <w:rPr>
+          <w:sz w:val="16"/>
+          <w:szCs w:val="16"/>
+          <w:lang w:val="en-GB"/>
+        </w:rPr>
+        <w:t xml:space="preserve">.\bin\windows\kafka-storage.bat format --standalone -t </w:t>
+      </w:r>
+      <w:r>
+        <w:rPr>
+          <w:b/>
+          <w:bCs/>
+          <w:sz w:val="16"/>
+          <w:szCs w:val="16"/>
+          <w:lang w:val="en-GB"/>
+        </w:rPr>
+        <w:t>cXSMH3t3RgqIB7nQa7PMxQ</w:t>
+      </w:r>
+      <w:r>
+        <w:rPr>
+          <w:b/>
+          <w:bCs/>
+          <w:sz w:val="16"/>
+          <w:szCs w:val="16"/>
+          <w:lang w:val="en-GB"/>
+        </w:rPr>
+        <w:t xml:space="preserve"> </w:t>
+      </w:r>
+      <w:r>
+        <w:rPr>
+          <w:sz w:val="16"/>
+          <w:szCs w:val="16"/>
+          <w:lang w:val="en-GB"/>
+        </w:rPr>
+        <w:t>-c .\config\</w:t>
+      </w:r>
+      <w:proofErr w:type="spellStart"/>
+      <w:r>
+        <w:rPr>
+          <w:sz w:val="16"/>
+          <w:szCs w:val="16"/>
+          <w:lang w:val="en-GB"/>
+        </w:rPr>
+        <w:t>server.properties</w:t>
+      </w:r>
+      <w:proofErr w:type="spellEnd"/>
+    </w:p>
+    <w:p>
+      <w:pPr>
+        <w:rPr>
+          <w:b/>
+          <w:bCs/>
+          <w:lang w:val="en-GB"/>
+        </w:rPr>
+      </w:pPr>
+      <w:r>
+        <w:rPr>
+          <w:b/>
+          <w:bCs/>
+          <w:lang w:val="en-GB"/>
+        </w:rPr>
+        <w:t xml:space="preserve">3. </w:t>
+      </w:r>
+      <w:r>
+        <w:rPr>
+          <w:b/>
+          <w:bCs/>
+          <w:lang w:val="en-GB"/>
+        </w:rPr>
         <w:t>Then start Kafka:</w:t>
       </w:r>
     </w:p>
@@ -425,8 +783,16 @@
         <w:rPr>
           <w:lang w:val="en-GB"/>
         </w:rPr>
-        <w:t>.\bin\windows\kafka-server-start.bat .\config\server.properties</w:t>
-      </w:r>
+        <w:t>.\bin\windows\kafka-server-start.bat .\config\</w:t>
+      </w:r>
+      <w:proofErr w:type="spellStart"/>
+      <w:r>
+        <w:rPr>
+          <w:lang w:val="en-GB"/>
+        </w:rPr>
+        <w:t>server.properties</w:t>
+      </w:r>
+      <w:proofErr w:type="spellEnd"/>
     </w:p>
     <w:p>
       <w:pPr>
@@ -463,8 +829,16 @@
         <w:rPr>
           <w:lang w:val="en-GB"/>
         </w:rPr>
-        <w:t>.\bin\windows\kafka-storage.bat format --standalone -t S1oFxk8pQpmFGAnlQG5bjQ -c .\config\server.properties</w:t>
-      </w:r>
+        <w:t>.\bin\windows\kafka-storage.bat format --standalone -t S1oFxk8pQpmFGAnlQG5bjQ -c .\config\</w:t>
+      </w:r>
+      <w:proofErr w:type="spellStart"/>
+      <w:r>
+        <w:rPr>
+          <w:lang w:val="en-GB"/>
+        </w:rPr>
+        <w:t>server.properties</w:t>
+      </w:r>
+      <w:proofErr w:type="spellEnd"/>
     </w:p>
     <w:p>
       <w:pPr>
@@ -513,7 +887,35 @@
         <w:rPr>
           <w:lang w:val="en-GB"/>
         </w:rPr>
-        <w:t>netstat -ano | findstr :9092</w:t>
+        <w:t>netstat -</w:t>
+      </w:r>
+      <w:proofErr w:type="spellStart"/>
+      <w:r>
+        <w:rPr>
+          <w:lang w:val="en-GB"/>
+        </w:rPr>
+        <w:t>ano</w:t>
+      </w:r>
+      <w:proofErr w:type="spellEnd"/>
+      <w:r>
+        <w:rPr>
+          <w:lang w:val="en-GB"/>
+        </w:rPr>
+        <w:t xml:space="preserve"> | </w:t>
+      </w:r>
+      <w:proofErr w:type="spellStart"/>
+      <w:r>
+        <w:rPr>
+          <w:lang w:val="en-GB"/>
+        </w:rPr>
+        <w:t>findstr</w:t>
+      </w:r>
+      <w:proofErr w:type="spellEnd"/>
+      <w:r>
+        <w:rPr>
+          <w:lang w:val="en-GB"/>
+        </w:rPr>
+        <w:t xml:space="preserve"> :9092</w:t>
       </w:r>
     </w:p>
     <w:p>
@@ -541,6 +943,241 @@
         </w:rPr>
         <w:t>.\bin\windows\kafka-topics.bat --list --bootstrap-server localhost:9092</w:t>
       </w:r>
+    </w:p>
+    <w:p>
+      <w:pPr>
+        <w:rPr>
+          <w:lang w:val="en-GB"/>
+        </w:rPr>
+      </w:pPr>
+    </w:p>
+    <w:p>
+      <w:pPr>
+        <w:rPr>
+          <w:lang w:val="en-GB"/>
+        </w:rPr>
+      </w:pPr>
+    </w:p>
+    <w:p>
+      <w:pPr>
+        <w:rPr>
+          <w:lang w:val="en-GB"/>
+        </w:rPr>
+      </w:pPr>
+    </w:p>
+    <w:p>
+      <w:pPr>
+        <w:rPr>
+          <w:lang w:val="en-GB"/>
+        </w:rPr>
+      </w:pPr>
+    </w:p>
+    <w:p>
+      <w:pPr>
+        <w:rPr>
+          <w:lang w:val="en-GB"/>
+        </w:rPr>
+      </w:pPr>
+      <w:r>
+        <w:rPr>
+          <w:lang w:val="en-GB"/>
+        </w:rPr>
+        <w:lastRenderedPageBreak/>
+        <w:t>7. Create Topics</w:t>
+      </w:r>
+    </w:p>
+    <w:p>
+      <w:pPr>
+        <w:rPr>
+          <w:lang w:val="en-GB"/>
+        </w:rPr>
+      </w:pPr>
+      <w:r>
+        <w:rPr>
+          <w:lang w:val="en-GB"/>
+        </w:rPr>
+        <w:t xml:space="preserve">.\bin\windows\kafka-topics.bat --create --topic </w:t>
+      </w:r>
+      <w:proofErr w:type="spellStart"/>
+      <w:proofErr w:type="gramStart"/>
+      <w:r>
+        <w:rPr>
+          <w:lang w:val="en-GB"/>
+        </w:rPr>
+        <w:t>order.created</w:t>
+      </w:r>
+      <w:proofErr w:type="spellEnd"/>
+      <w:proofErr w:type="gramEnd"/>
+      <w:r>
+        <w:rPr>
+          <w:lang w:val="en-GB"/>
+        </w:rPr>
+        <w:t xml:space="preserve"> --bootstrap-server localhost:9092 --partitions 1 --replication-factor 1</w:t>
+      </w:r>
+    </w:p>
+    <w:p>
+      <w:pPr>
+        <w:rPr>
+          <w:lang w:val="en-GB"/>
+        </w:rPr>
+      </w:pPr>
+    </w:p>
+    <w:p>
+      <w:pPr>
+        <w:rPr>
+          <w:lang w:val="en-GB"/>
+        </w:rPr>
+      </w:pPr>
+      <w:r>
+        <w:rPr>
+          <w:lang w:val="en-GB"/>
+        </w:rPr>
+        <w:t xml:space="preserve">.\bin\windows\kafka-topics.bat --create --topic </w:t>
+      </w:r>
+      <w:proofErr w:type="spellStart"/>
+      <w:proofErr w:type="gramStart"/>
+      <w:r>
+        <w:rPr>
+          <w:lang w:val="en-GB"/>
+        </w:rPr>
+        <w:t>payment.completed</w:t>
+      </w:r>
+      <w:proofErr w:type="spellEnd"/>
+      <w:proofErr w:type="gramEnd"/>
+      <w:r>
+        <w:rPr>
+          <w:lang w:val="en-GB"/>
+        </w:rPr>
+        <w:t xml:space="preserve"> --bootstrap-server localhost:9092 --partitions 1 --replication-factor 1</w:t>
+      </w:r>
+    </w:p>
+    <w:p>
+      <w:pPr>
+        <w:rPr>
+          <w:lang w:val="en-GB"/>
+        </w:rPr>
+      </w:pPr>
+    </w:p>
+    <w:p>
+      <w:pPr>
+        <w:rPr>
+          <w:lang w:val="en-GB"/>
+        </w:rPr>
+      </w:pPr>
+      <w:r>
+        <w:rPr>
+          <w:lang w:val="en-GB"/>
+        </w:rPr>
+        <w:t xml:space="preserve">.\bin\windows\kafka-topics.bat --create --topic </w:t>
+      </w:r>
+      <w:proofErr w:type="spellStart"/>
+      <w:proofErr w:type="gramStart"/>
+      <w:r>
+        <w:rPr>
+          <w:lang w:val="en-GB"/>
+        </w:rPr>
+        <w:t>payment.failed</w:t>
+      </w:r>
+      <w:proofErr w:type="spellEnd"/>
+      <w:proofErr w:type="gramEnd"/>
+      <w:r>
+        <w:rPr>
+          <w:lang w:val="en-GB"/>
+        </w:rPr>
+        <w:t xml:space="preserve"> --bootstrap-server localhost:9092 --partitions 1 --replication-factor 1</w:t>
+      </w:r>
+    </w:p>
+    <w:p>
+      <w:pPr>
+        <w:rPr>
+          <w:lang w:val="en-GB"/>
+        </w:rPr>
+      </w:pPr>
+    </w:p>
+    <w:p>
+      <w:pPr>
+        <w:rPr>
+          <w:lang w:val="en-GB"/>
+        </w:rPr>
+      </w:pPr>
+      <w:r>
+        <w:rPr>
+          <w:lang w:val="en-GB"/>
+        </w:rPr>
+        <w:t xml:space="preserve">.\bin\windows\kafka-topics.bat --create --topic </w:t>
+      </w:r>
+      <w:proofErr w:type="spellStart"/>
+      <w:proofErr w:type="gramStart"/>
+      <w:r>
+        <w:rPr>
+          <w:lang w:val="en-GB"/>
+        </w:rPr>
+        <w:t>product.stock</w:t>
+      </w:r>
+      <w:proofErr w:type="gramEnd"/>
+      <w:r>
+        <w:rPr>
+          <w:lang w:val="en-GB"/>
+        </w:rPr>
+        <w:t>.requested</w:t>
+      </w:r>
+      <w:proofErr w:type="spellEnd"/>
+      <w:r>
+        <w:rPr>
+          <w:lang w:val="en-GB"/>
+        </w:rPr>
+        <w:t xml:space="preserve"> --bootstrap-server localhost:9092 --partitions 1 --replication-factor 1</w:t>
+      </w:r>
+    </w:p>
+    <w:p>
+      <w:pPr>
+        <w:rPr>
+          <w:lang w:val="en-GB"/>
+        </w:rPr>
+      </w:pPr>
+    </w:p>
+    <w:p>
+      <w:pPr>
+        <w:rPr>
+          <w:lang w:val="en-GB"/>
+        </w:rPr>
+      </w:pPr>
+      <w:r>
+        <w:rPr>
+          <w:lang w:val="en-GB"/>
+        </w:rPr>
+        <w:t xml:space="preserve">.\bin\windows\kafka-topics.bat --create --topic </w:t>
+      </w:r>
+      <w:proofErr w:type="spellStart"/>
+      <w:proofErr w:type="gramStart"/>
+      <w:r>
+        <w:rPr>
+          <w:lang w:val="en-GB"/>
+        </w:rPr>
+        <w:t>delivery.completed</w:t>
+      </w:r>
+      <w:proofErr w:type="spellEnd"/>
+      <w:proofErr w:type="gramEnd"/>
+      <w:r>
+        <w:rPr>
+          <w:lang w:val="en-GB"/>
+        </w:rPr>
+        <w:t xml:space="preserve"> --bootstrap-server localhost:9092 --partitions 1 --replication-factor 1</w:t>
+      </w:r>
+    </w:p>
+    <w:p>
+      <w:pPr>
+        <w:rPr>
+          <w:lang w:val="en-GB"/>
+        </w:rPr>
+      </w:pPr>
+    </w:p>
+    <w:p>
+      <w:pPr>
+        <w:rPr>
+          <w:lang w:val="en-GB"/>
+        </w:rPr>
+      </w:pPr>
     </w:p>
     <w:p>
       <w:pPr>
@@ -1282,6 +1919,95 @@
 <file path=word/numbering.xml><?xml version="1.0" encoding="utf-8"?>
 <w:numbering xmlns:wpc="http://schemas.microsoft.com/office/word/2010/wordprocessingCanvas" xmlns:cx="http://schemas.microsoft.com/office/drawing/2014/chartex" xmlns:cx1="http://schemas.microsoft.com/office/drawing/2015/9/8/chartex" xmlns:cx2="http://schemas.microsoft.com/office/drawing/2015/10/21/chartex" xmlns:cx3="http://schemas.microsoft.com/office/drawing/2016/5/9/chartex" xmlns:cx4="http://schemas.microsoft.com/office/drawing/2016/5/10/chartex" xmlns:cx5="http://schemas.microsoft.com/office/drawing/2016/5/11/chartex" xmlns:cx6="http://schemas.microsoft.com/office/drawing/2016/5/12/chartex" xmlns:cx7="http://schemas.microsoft.com/office/drawing/2016/5/13/chartex" xmlns:cx8="http://schemas.microsoft.com/office/drawing/2016/5/14/chartex" xmlns:mc="http://schemas.openxmlformats.org/markup-compatibility/2006" xmlns:aink="http://schemas.microsoft.com/office/drawing/2016/ink" xmlns:am3d="http://schemas.microsoft.com/office/drawing/2017/model3d" xmlns:o="urn:schemas-microsoft-com:office:office" xmlns:oel="http://schemas.microsoft.com/office/2019/extlst" xmlns:r="http://schemas.openxmlformats.org/officeDocument/2006/relationships" xmlns:m="http://schemas.openxmlformats.org/officeDocument/2006/math" xmlns:v="urn:schemas-microsoft-com:vml" xmlns:wp14="http://schemas.microsoft.com/office/word/2010/wordprocessingDrawing" xmlns:wp="http://schemas.openxmlformats.org/drawingml/2006/wordprocessingDrawing" xmlns:w10="urn:schemas-microsoft-com:office:word" xmlns:w="http://schemas.openxmlformats.org/wordprocessingml/2006/main" xmlns:w14="http://schemas.microsoft.com/office/word/2010/wordml" xmlns:w15="http://schemas.microsoft.com/office/word/2012/wordml" xmlns:w16cex="http://schemas.microsoft.com/office/word/2018/wordml/cex" xmlns:w16cid="http://schemas.microsoft.com/office/word/2016/wordml/cid" xmlns:w16="http://schemas.microsoft.com/office/word/2018/wordml" xmlns:w16du="http://schemas.microsoft.com/office/word/2023/wordml/word16du" xmlns:w16sdtdh="http://schemas.microsoft.com/office/word/2020/wordml/sdtdatahash" xmlns:w16sdtfl="http://schemas.microsoft.com/office/word/2024/wordml/sdtformatlock" xmlns:w16se="http://schemas.microsoft.com/office/word/2015/wordml/symex" xmlns:wpg="http://schemas.microsoft.com/office/word/2010/wordprocessingGroup" xmlns:wpi="http://schemas.microsoft.com/office/word/2010/wordprocessingInk" xmlns:wne="http://schemas.microsoft.com/office/word/2006/wordml" xmlns:wps="http://schemas.microsoft.com/office/word/2010/wordprocessingShape" mc:Ignorable="w14 w15 w16se w16cid w16 w16cex w16sdtdh w16sdtfl w16du wp14">
   <w:abstractNum w:abstractNumId="0" w15:restartNumberingAfterBreak="0">
+    <w:nsid w:val="1C8C507C"/>
+    <w:multiLevelType w:val="hybridMultilevel"/>
+    <w:tmpl w:val="32CAD178"/>
+    <w:lvl w:ilvl="0" w:tplc="0407000F">
+      <w:start w:val="1"/>
+      <w:numFmt w:val="decimal"/>
+      <w:lvlText w:val="%1."/>
+      <w:lvlJc w:val="left"/>
+      <w:pPr>
+        <w:ind w:left="720" w:hanging="360"/>
+      </w:pPr>
+      <w:rPr>
+        <w:rFonts w:hint="default"/>
+      </w:rPr>
+    </w:lvl>
+    <w:lvl w:ilvl="1" w:tplc="04070019" w:tentative="1">
+      <w:start w:val="1"/>
+      <w:numFmt w:val="lowerLetter"/>
+      <w:lvlText w:val="%2."/>
+      <w:lvlJc w:val="left"/>
+      <w:pPr>
+        <w:ind w:left="1440" w:hanging="360"/>
+      </w:pPr>
+    </w:lvl>
+    <w:lvl w:ilvl="2" w:tplc="0407001B" w:tentative="1">
+      <w:start w:val="1"/>
+      <w:numFmt w:val="lowerRoman"/>
+      <w:lvlText w:val="%3."/>
+      <w:lvlJc w:val="right"/>
+      <w:pPr>
+        <w:ind w:left="2160" w:hanging="180"/>
+      </w:pPr>
+    </w:lvl>
+    <w:lvl w:ilvl="3" w:tplc="0407000F" w:tentative="1">
+      <w:start w:val="1"/>
+      <w:numFmt w:val="decimal"/>
+      <w:lvlText w:val="%4."/>
+      <w:lvlJc w:val="left"/>
+      <w:pPr>
+        <w:ind w:left="2880" w:hanging="360"/>
+      </w:pPr>
+    </w:lvl>
+    <w:lvl w:ilvl="4" w:tplc="04070019" w:tentative="1">
+      <w:start w:val="1"/>
+      <w:numFmt w:val="lowerLetter"/>
+      <w:lvlText w:val="%5."/>
+      <w:lvlJc w:val="left"/>
+      <w:pPr>
+        <w:ind w:left="3600" w:hanging="360"/>
+      </w:pPr>
+    </w:lvl>
+    <w:lvl w:ilvl="5" w:tplc="0407001B" w:tentative="1">
+      <w:start w:val="1"/>
+      <w:numFmt w:val="lowerRoman"/>
+      <w:lvlText w:val="%6."/>
+      <w:lvlJc w:val="right"/>
+      <w:pPr>
+        <w:ind w:left="4320" w:hanging="180"/>
+      </w:pPr>
+    </w:lvl>
+    <w:lvl w:ilvl="6" w:tplc="0407000F" w:tentative="1">
+      <w:start w:val="1"/>
+      <w:numFmt w:val="decimal"/>
+      <w:lvlText w:val="%7."/>
+      <w:lvlJc w:val="left"/>
+      <w:pPr>
+        <w:ind w:left="5040" w:hanging="360"/>
+      </w:pPr>
+    </w:lvl>
+    <w:lvl w:ilvl="7" w:tplc="04070019" w:tentative="1">
+      <w:start w:val="1"/>
+      <w:numFmt w:val="lowerLetter"/>
+      <w:lvlText w:val="%8."/>
+      <w:lvlJc w:val="left"/>
+      <w:pPr>
+        <w:ind w:left="5760" w:hanging="360"/>
+      </w:pPr>
+    </w:lvl>
+    <w:lvl w:ilvl="8" w:tplc="0407001B" w:tentative="1">
+      <w:start w:val="1"/>
+      <w:numFmt w:val="lowerRoman"/>
+      <w:lvlText w:val="%9."/>
+      <w:lvlJc w:val="right"/>
+      <w:pPr>
+        <w:ind w:left="6480" w:hanging="180"/>
+      </w:pPr>
+    </w:lvl>
+  </w:abstractNum>
+  <w:abstractNum w:abstractNumId="1" w15:restartNumberingAfterBreak="0">
     <w:nsid w:val="23A225E7"/>
     <w:multiLevelType w:val="hybridMultilevel"/>
     <w:tmpl w:val="D318EE1C"/>
@@ -1394,6 +2120,9 @@
     </w:lvl>
   </w:abstractNum>
   <w:num w:numId="1" w16cid:durableId="970592165">
+    <w:abstractNumId w:val="1"/>
+  </w:num>
+  <w:num w:numId="2" w16cid:durableId="1622035461">
     <w:abstractNumId w:val="0"/>
   </w:num>
 </w:numbering>
@@ -2002,7 +2731,6 @@
   <w:style w:type="character" w:default="1" w:styleId="Absatz-Standardschriftart">
     <w:name w:val="Default Paragraph Font"/>
     <w:uiPriority w:val="1"/>
-    <w:semiHidden/>
     <w:unhideWhenUsed/>
   </w:style>
   <w:style w:type="table" w:default="1" w:styleId="NormaleTabelle">

</xml_diff>

<commit_message>
- Update User interface frontend and layout - Add local E2E coverage for order payment and delivery workflow - Configure dedicated local test databases - Configure services with test Spring profile - Add E2E order payment delivery workflow
</commit_message>
<xml_diff>
--- a/documentation/GWatcho-MicroService-App.docx
+++ b/documentation/GWatcho-MicroService-App.docx
@@ -5411,12 +5411,48 @@
         <w:t>/delivery-service           Up ...</w:t>
       </w:r>
     </w:p>
-    <w:p/>
-    <w:p/>
-    <w:p/>
-    <w:p/>
-    <w:p/>
-    <w:p/>
+    <w:p>
+      <w:pPr>
+        <w:rPr>
+          <w:lang w:val="en-GB"/>
+        </w:rPr>
+      </w:pPr>
+    </w:p>
+    <w:p>
+      <w:pPr>
+        <w:rPr>
+          <w:lang w:val="en-GB"/>
+        </w:rPr>
+      </w:pPr>
+    </w:p>
+    <w:p>
+      <w:pPr>
+        <w:rPr>
+          <w:lang w:val="en-GB"/>
+        </w:rPr>
+      </w:pPr>
+    </w:p>
+    <w:p>
+      <w:pPr>
+        <w:rPr>
+          <w:lang w:val="en-GB"/>
+        </w:rPr>
+      </w:pPr>
+    </w:p>
+    <w:p>
+      <w:pPr>
+        <w:rPr>
+          <w:lang w:val="en-GB"/>
+        </w:rPr>
+      </w:pPr>
+    </w:p>
+    <w:p>
+      <w:pPr>
+        <w:rPr>
+          <w:lang w:val="en-GB"/>
+        </w:rPr>
+      </w:pPr>
+    </w:p>
     <w:p>
       <w:pPr>
         <w:rPr>
@@ -5791,7 +5827,7 @@
           <w:lang w:val="en-GB" w:eastAsia="de-DE"/>
           <w14:ligatures w14:val="none"/>
         </w:rPr>
-        <w:t xml:space="preserve">   docker build -t gwatch</w:t>
+        <w:t xml:space="preserve">   docker build -t </w:t>
       </w:r>
       <w:proofErr w:type="spellStart"/>
       <w:r>
@@ -5803,7 +5839,7 @@
           <w:lang w:val="en-GB" w:eastAsia="de-DE"/>
           <w14:ligatures w14:val="none"/>
         </w:rPr>
-        <w:t>o</w:t>
+        <w:t>gwatcho</w:t>
       </w:r>
       <w:proofErr w:type="spellEnd"/>
       <w:r>
@@ -6518,6 +6554,1149 @@
           <w:lang w:val="en-GB"/>
         </w:rPr>
       </w:pPr>
+    </w:p>
+    <w:p>
+      <w:pPr>
+        <w:rPr>
+          <w:sz w:val="22"/>
+          <w:szCs w:val="22"/>
+          <w:lang w:val="en-GB"/>
+        </w:rPr>
+      </w:pPr>
+    </w:p>
+    <w:p>
+      <w:pPr>
+        <w:rPr>
+          <w:sz w:val="22"/>
+          <w:szCs w:val="22"/>
+          <w:lang w:val="en-GB"/>
+        </w:rPr>
+      </w:pPr>
+    </w:p>
+    <w:p>
+      <w:pPr>
+        <w:rPr>
+          <w:b/>
+          <w:bCs/>
+          <w:sz w:val="22"/>
+          <w:szCs w:val="22"/>
+        </w:rPr>
+      </w:pPr>
+      <w:r>
+        <w:rPr>
+          <w:b/>
+          <w:bCs/>
+          <w:sz w:val="22"/>
+          <w:szCs w:val="22"/>
+        </w:rPr>
+        <w:lastRenderedPageBreak/>
+        <w:t xml:space="preserve">Recommended professional </w:t>
+      </w:r>
+      <w:proofErr w:type="spellStart"/>
+      <w:r>
+        <w:rPr>
+          <w:b/>
+          <w:bCs/>
+          <w:sz w:val="22"/>
+          <w:szCs w:val="22"/>
+        </w:rPr>
+        <w:t>setup</w:t>
+      </w:r>
+      <w:proofErr w:type="spellEnd"/>
+    </w:p>
+    <w:tbl>
+      <w:tblPr>
+        <w:tblW w:w="0" w:type="auto"/>
+        <w:tblCellSpacing w:w="15" w:type="dxa"/>
+        <w:tblCellMar>
+          <w:top w:w="15" w:type="dxa"/>
+          <w:left w:w="15" w:type="dxa"/>
+          <w:bottom w:w="15" w:type="dxa"/>
+          <w:right w:w="15" w:type="dxa"/>
+        </w:tblCellMar>
+        <w:tblLook w:val="04A0" w:firstRow="1" w:lastRow="0" w:firstColumn="1" w:lastColumn="0" w:noHBand="0" w:noVBand="1"/>
+      </w:tblPr>
+      <w:tblGrid>
+        <w:gridCol w:w="2071"/>
+        <w:gridCol w:w="3277"/>
+        <w:gridCol w:w="3668"/>
+      </w:tblGrid>
+      <w:tr>
+        <w:trPr>
+          <w:tblHeader/>
+          <w:tblCellSpacing w:w="15" w:type="dxa"/>
+        </w:trPr>
+        <w:tc>
+          <w:tcPr>
+            <w:tcW w:w="0" w:type="auto"/>
+            <w:vAlign w:val="center"/>
+            <w:hideMark/>
+          </w:tcPr>
+          <w:p>
+            <w:pPr>
+              <w:rPr>
+                <w:b/>
+                <w:bCs/>
+                <w:sz w:val="22"/>
+                <w:szCs w:val="22"/>
+              </w:rPr>
+            </w:pPr>
+            <w:r>
+              <w:rPr>
+                <w:b/>
+                <w:bCs/>
+                <w:sz w:val="22"/>
+                <w:szCs w:val="22"/>
+              </w:rPr>
+              <w:t>Test type</w:t>
+            </w:r>
+          </w:p>
+        </w:tc>
+        <w:tc>
+          <w:tcPr>
+            <w:tcW w:w="0" w:type="auto"/>
+            <w:vAlign w:val="center"/>
+            <w:hideMark/>
+          </w:tcPr>
+          <w:p>
+            <w:pPr>
+              <w:rPr>
+                <w:b/>
+                <w:bCs/>
+                <w:sz w:val="22"/>
+                <w:szCs w:val="22"/>
+              </w:rPr>
+            </w:pPr>
+            <w:r>
+              <w:rPr>
+                <w:b/>
+                <w:bCs/>
+                <w:sz w:val="22"/>
+                <w:szCs w:val="22"/>
+              </w:rPr>
+              <w:t>Database</w:t>
+            </w:r>
+          </w:p>
+        </w:tc>
+        <w:tc>
+          <w:tcPr>
+            <w:tcW w:w="0" w:type="auto"/>
+            <w:vAlign w:val="center"/>
+            <w:hideMark/>
+          </w:tcPr>
+          <w:p>
+            <w:pPr>
+              <w:rPr>
+                <w:b/>
+                <w:bCs/>
+                <w:sz w:val="22"/>
+                <w:szCs w:val="22"/>
+              </w:rPr>
+            </w:pPr>
+            <w:r>
+              <w:rPr>
+                <w:b/>
+                <w:bCs/>
+                <w:sz w:val="22"/>
+                <w:szCs w:val="22"/>
+              </w:rPr>
+              <w:t>Purpose</w:t>
+            </w:r>
+          </w:p>
+        </w:tc>
+      </w:tr>
+      <w:tr>
+        <w:trPr>
+          <w:tblCellSpacing w:w="15" w:type="dxa"/>
+        </w:trPr>
+        <w:tc>
+          <w:tcPr>
+            <w:tcW w:w="0" w:type="auto"/>
+            <w:vAlign w:val="center"/>
+            <w:hideMark/>
+          </w:tcPr>
+          <w:p>
+            <w:pPr>
+              <w:rPr>
+                <w:sz w:val="22"/>
+                <w:szCs w:val="22"/>
+              </w:rPr>
+            </w:pPr>
+            <w:r>
+              <w:rPr>
+                <w:sz w:val="22"/>
+                <w:szCs w:val="22"/>
+              </w:rPr>
+              <w:t xml:space="preserve">Unit </w:t>
+            </w:r>
+            <w:proofErr w:type="spellStart"/>
+            <w:r>
+              <w:rPr>
+                <w:sz w:val="22"/>
+                <w:szCs w:val="22"/>
+              </w:rPr>
+              <w:t>tests</w:t>
+            </w:r>
+            <w:proofErr w:type="spellEnd"/>
+          </w:p>
+        </w:tc>
+        <w:tc>
+          <w:tcPr>
+            <w:tcW w:w="0" w:type="auto"/>
+            <w:vAlign w:val="center"/>
+            <w:hideMark/>
+          </w:tcPr>
+          <w:p>
+            <w:pPr>
+              <w:rPr>
+                <w:sz w:val="22"/>
+                <w:szCs w:val="22"/>
+              </w:rPr>
+            </w:pPr>
+            <w:proofErr w:type="spellStart"/>
+            <w:r>
+              <w:rPr>
+                <w:b/>
+                <w:bCs/>
+                <w:sz w:val="22"/>
+                <w:szCs w:val="22"/>
+              </w:rPr>
+              <w:t>No</w:t>
+            </w:r>
+            <w:proofErr w:type="spellEnd"/>
+            <w:r>
+              <w:rPr>
+                <w:b/>
+                <w:bCs/>
+                <w:sz w:val="22"/>
+                <w:szCs w:val="22"/>
+              </w:rPr>
+              <w:t xml:space="preserve"> </w:t>
+            </w:r>
+            <w:proofErr w:type="spellStart"/>
+            <w:r>
+              <w:rPr>
+                <w:b/>
+                <w:bCs/>
+                <w:sz w:val="22"/>
+                <w:szCs w:val="22"/>
+              </w:rPr>
+              <w:t>database</w:t>
+            </w:r>
+            <w:proofErr w:type="spellEnd"/>
+          </w:p>
+        </w:tc>
+        <w:tc>
+          <w:tcPr>
+            <w:tcW w:w="0" w:type="auto"/>
+            <w:vAlign w:val="center"/>
+            <w:hideMark/>
+          </w:tcPr>
+          <w:p>
+            <w:pPr>
+              <w:rPr>
+                <w:sz w:val="22"/>
+                <w:szCs w:val="22"/>
+              </w:rPr>
+            </w:pPr>
+            <w:r>
+              <w:rPr>
+                <w:sz w:val="22"/>
+                <w:szCs w:val="22"/>
+              </w:rPr>
+              <w:t xml:space="preserve">Test </w:t>
+            </w:r>
+            <w:proofErr w:type="spellStart"/>
+            <w:r>
+              <w:rPr>
+                <w:sz w:val="22"/>
+                <w:szCs w:val="22"/>
+              </w:rPr>
+              <w:t>business</w:t>
+            </w:r>
+            <w:proofErr w:type="spellEnd"/>
+            <w:r>
+              <w:rPr>
+                <w:sz w:val="22"/>
+                <w:szCs w:val="22"/>
+              </w:rPr>
+              <w:t xml:space="preserve"> </w:t>
+            </w:r>
+            <w:proofErr w:type="spellStart"/>
+            <w:r>
+              <w:rPr>
+                <w:sz w:val="22"/>
+                <w:szCs w:val="22"/>
+              </w:rPr>
+              <w:t>logic</w:t>
+            </w:r>
+            <w:proofErr w:type="spellEnd"/>
+            <w:r>
+              <w:rPr>
+                <w:sz w:val="22"/>
+                <w:szCs w:val="22"/>
+              </w:rPr>
+              <w:t xml:space="preserve"> </w:t>
+            </w:r>
+            <w:proofErr w:type="spellStart"/>
+            <w:r>
+              <w:rPr>
+                <w:sz w:val="22"/>
+                <w:szCs w:val="22"/>
+              </w:rPr>
+              <w:t>quickly</w:t>
+            </w:r>
+            <w:proofErr w:type="spellEnd"/>
+          </w:p>
+        </w:tc>
+      </w:tr>
+      <w:tr>
+        <w:trPr>
+          <w:tblCellSpacing w:w="15" w:type="dxa"/>
+        </w:trPr>
+        <w:tc>
+          <w:tcPr>
+            <w:tcW w:w="0" w:type="auto"/>
+            <w:vAlign w:val="center"/>
+            <w:hideMark/>
+          </w:tcPr>
+          <w:p>
+            <w:pPr>
+              <w:rPr>
+                <w:sz w:val="22"/>
+                <w:szCs w:val="22"/>
+              </w:rPr>
+            </w:pPr>
+            <w:r>
+              <w:rPr>
+                <w:sz w:val="22"/>
+                <w:szCs w:val="22"/>
+              </w:rPr>
+              <w:t xml:space="preserve">Repository/JPA </w:t>
+            </w:r>
+            <w:proofErr w:type="spellStart"/>
+            <w:r>
+              <w:rPr>
+                <w:sz w:val="22"/>
+                <w:szCs w:val="22"/>
+              </w:rPr>
+              <w:t>tests</w:t>
+            </w:r>
+            <w:proofErr w:type="spellEnd"/>
+          </w:p>
+        </w:tc>
+        <w:tc>
+          <w:tcPr>
+            <w:tcW w:w="0" w:type="auto"/>
+            <w:vAlign w:val="center"/>
+            <w:hideMark/>
+          </w:tcPr>
+          <w:p>
+            <w:pPr>
+              <w:rPr>
+                <w:sz w:val="22"/>
+                <w:szCs w:val="22"/>
+              </w:rPr>
+            </w:pPr>
+            <w:r>
+              <w:rPr>
+                <w:b/>
+                <w:bCs/>
+                <w:sz w:val="22"/>
+                <w:szCs w:val="22"/>
+              </w:rPr>
+              <w:t>MySQL</w:t>
+            </w:r>
+          </w:p>
+        </w:tc>
+        <w:tc>
+          <w:tcPr>
+            <w:tcW w:w="0" w:type="auto"/>
+            <w:vAlign w:val="center"/>
+            <w:hideMark/>
+          </w:tcPr>
+          <w:p>
+            <w:pPr>
+              <w:rPr>
+                <w:sz w:val="22"/>
+                <w:szCs w:val="22"/>
+                <w:lang w:val="en-GB"/>
+              </w:rPr>
+            </w:pPr>
+            <w:r>
+              <w:rPr>
+                <w:sz w:val="22"/>
+                <w:szCs w:val="22"/>
+                <w:lang w:val="en-GB"/>
+              </w:rPr>
+              <w:t>Verify real SQL, mappings, constraints</w:t>
+            </w:r>
+          </w:p>
+        </w:tc>
+      </w:tr>
+      <w:tr>
+        <w:trPr>
+          <w:tblCellSpacing w:w="15" w:type="dxa"/>
+        </w:trPr>
+        <w:tc>
+          <w:tcPr>
+            <w:tcW w:w="0" w:type="auto"/>
+            <w:vAlign w:val="center"/>
+            <w:hideMark/>
+          </w:tcPr>
+          <w:p>
+            <w:pPr>
+              <w:rPr>
+                <w:sz w:val="22"/>
+                <w:szCs w:val="22"/>
+              </w:rPr>
+            </w:pPr>
+            <w:r>
+              <w:rPr>
+                <w:sz w:val="22"/>
+                <w:szCs w:val="22"/>
+              </w:rPr>
+              <w:t xml:space="preserve">Integration </w:t>
+            </w:r>
+            <w:proofErr w:type="spellStart"/>
+            <w:r>
+              <w:rPr>
+                <w:sz w:val="22"/>
+                <w:szCs w:val="22"/>
+              </w:rPr>
+              <w:t>tests</w:t>
+            </w:r>
+            <w:proofErr w:type="spellEnd"/>
+          </w:p>
+        </w:tc>
+        <w:tc>
+          <w:tcPr>
+            <w:tcW w:w="0" w:type="auto"/>
+            <w:vAlign w:val="center"/>
+            <w:hideMark/>
+          </w:tcPr>
+          <w:p>
+            <w:pPr>
+              <w:rPr>
+                <w:sz w:val="22"/>
+                <w:szCs w:val="22"/>
+              </w:rPr>
+            </w:pPr>
+            <w:r>
+              <w:rPr>
+                <w:b/>
+                <w:bCs/>
+                <w:sz w:val="22"/>
+                <w:szCs w:val="22"/>
+              </w:rPr>
+              <w:t>MySQL</w:t>
+            </w:r>
+          </w:p>
+        </w:tc>
+        <w:tc>
+          <w:tcPr>
+            <w:tcW w:w="0" w:type="auto"/>
+            <w:vAlign w:val="center"/>
+            <w:hideMark/>
+          </w:tcPr>
+          <w:p>
+            <w:pPr>
+              <w:rPr>
+                <w:sz w:val="22"/>
+                <w:szCs w:val="22"/>
+              </w:rPr>
+            </w:pPr>
+            <w:r>
+              <w:rPr>
+                <w:sz w:val="22"/>
+                <w:szCs w:val="22"/>
+              </w:rPr>
+              <w:t xml:space="preserve">Test </w:t>
+            </w:r>
+            <w:proofErr w:type="spellStart"/>
+            <w:r>
+              <w:rPr>
+                <w:sz w:val="22"/>
+                <w:szCs w:val="22"/>
+              </w:rPr>
+              <w:t>service</w:t>
+            </w:r>
+            <w:proofErr w:type="spellEnd"/>
+            <w:r>
+              <w:rPr>
+                <w:sz w:val="22"/>
+                <w:szCs w:val="22"/>
+              </w:rPr>
+              <w:t xml:space="preserve"> + </w:t>
+            </w:r>
+            <w:proofErr w:type="spellStart"/>
+            <w:r>
+              <w:rPr>
+                <w:sz w:val="22"/>
+                <w:szCs w:val="22"/>
+              </w:rPr>
+              <w:t>database</w:t>
+            </w:r>
+            <w:proofErr w:type="spellEnd"/>
+            <w:r>
+              <w:rPr>
+                <w:sz w:val="22"/>
+                <w:szCs w:val="22"/>
+              </w:rPr>
+              <w:t xml:space="preserve"> </w:t>
+            </w:r>
+            <w:proofErr w:type="spellStart"/>
+            <w:r>
+              <w:rPr>
+                <w:sz w:val="22"/>
+                <w:szCs w:val="22"/>
+              </w:rPr>
+              <w:t>together</w:t>
+            </w:r>
+            <w:proofErr w:type="spellEnd"/>
+          </w:p>
+        </w:tc>
+      </w:tr>
+      <w:tr>
+        <w:trPr>
+          <w:tblCellSpacing w:w="15" w:type="dxa"/>
+        </w:trPr>
+        <w:tc>
+          <w:tcPr>
+            <w:tcW w:w="0" w:type="auto"/>
+            <w:vAlign w:val="center"/>
+            <w:hideMark/>
+          </w:tcPr>
+          <w:p>
+            <w:pPr>
+              <w:rPr>
+                <w:sz w:val="22"/>
+                <w:szCs w:val="22"/>
+              </w:rPr>
+            </w:pPr>
+            <w:r>
+              <w:rPr>
+                <w:sz w:val="22"/>
+                <w:szCs w:val="22"/>
+              </w:rPr>
+              <w:t>API/</w:t>
+            </w:r>
+            <w:proofErr w:type="spellStart"/>
+            <w:r>
+              <w:rPr>
+                <w:sz w:val="22"/>
+                <w:szCs w:val="22"/>
+              </w:rPr>
+              <w:t>controller</w:t>
+            </w:r>
+            <w:proofErr w:type="spellEnd"/>
+            <w:r>
+              <w:rPr>
+                <w:sz w:val="22"/>
+                <w:szCs w:val="22"/>
+              </w:rPr>
+              <w:t xml:space="preserve"> </w:t>
+            </w:r>
+            <w:proofErr w:type="spellStart"/>
+            <w:r>
+              <w:rPr>
+                <w:sz w:val="22"/>
+                <w:szCs w:val="22"/>
+              </w:rPr>
+              <w:t>tests</w:t>
+            </w:r>
+            <w:proofErr w:type="spellEnd"/>
+          </w:p>
+        </w:tc>
+        <w:tc>
+          <w:tcPr>
+            <w:tcW w:w="0" w:type="auto"/>
+            <w:vAlign w:val="center"/>
+            <w:hideMark/>
+          </w:tcPr>
+          <w:p>
+            <w:pPr>
+              <w:rPr>
+                <w:sz w:val="22"/>
+                <w:szCs w:val="22"/>
+              </w:rPr>
+            </w:pPr>
+            <w:r>
+              <w:rPr>
+                <w:sz w:val="22"/>
+                <w:szCs w:val="22"/>
+              </w:rPr>
+              <w:t xml:space="preserve">Usually </w:t>
+            </w:r>
+            <w:proofErr w:type="spellStart"/>
+            <w:r>
+              <w:rPr>
+                <w:b/>
+                <w:bCs/>
+                <w:sz w:val="22"/>
+                <w:szCs w:val="22"/>
+              </w:rPr>
+              <w:t>mock</w:t>
+            </w:r>
+            <w:proofErr w:type="spellEnd"/>
+            <w:r>
+              <w:rPr>
+                <w:b/>
+                <w:bCs/>
+                <w:sz w:val="22"/>
+                <w:szCs w:val="22"/>
+              </w:rPr>
+              <w:t xml:space="preserve"> </w:t>
+            </w:r>
+            <w:proofErr w:type="spellStart"/>
+            <w:r>
+              <w:rPr>
+                <w:b/>
+                <w:bCs/>
+                <w:sz w:val="22"/>
+                <w:szCs w:val="22"/>
+              </w:rPr>
+              <w:t>repository</w:t>
+            </w:r>
+            <w:proofErr w:type="spellEnd"/>
+            <w:r>
+              <w:rPr>
+                <w:b/>
+                <w:bCs/>
+                <w:sz w:val="22"/>
+                <w:szCs w:val="22"/>
+              </w:rPr>
+              <w:t>/</w:t>
+            </w:r>
+            <w:proofErr w:type="spellStart"/>
+            <w:r>
+              <w:rPr>
+                <w:b/>
+                <w:bCs/>
+                <w:sz w:val="22"/>
+                <w:szCs w:val="22"/>
+              </w:rPr>
+              <w:t>service</w:t>
+            </w:r>
+            <w:proofErr w:type="spellEnd"/>
+          </w:p>
+        </w:tc>
+        <w:tc>
+          <w:tcPr>
+            <w:tcW w:w="0" w:type="auto"/>
+            <w:vAlign w:val="center"/>
+            <w:hideMark/>
+          </w:tcPr>
+          <w:p>
+            <w:pPr>
+              <w:rPr>
+                <w:sz w:val="22"/>
+                <w:szCs w:val="22"/>
+              </w:rPr>
+            </w:pPr>
+            <w:r>
+              <w:rPr>
+                <w:sz w:val="22"/>
+                <w:szCs w:val="22"/>
+              </w:rPr>
+              <w:t xml:space="preserve">Fast HTTP/API </w:t>
+            </w:r>
+            <w:proofErr w:type="spellStart"/>
+            <w:r>
+              <w:rPr>
+                <w:sz w:val="22"/>
+                <w:szCs w:val="22"/>
+              </w:rPr>
+              <w:t>tests</w:t>
+            </w:r>
+            <w:proofErr w:type="spellEnd"/>
+          </w:p>
+        </w:tc>
+      </w:tr>
+      <w:tr>
+        <w:trPr>
+          <w:tblCellSpacing w:w="15" w:type="dxa"/>
+        </w:trPr>
+        <w:tc>
+          <w:tcPr>
+            <w:tcW w:w="0" w:type="auto"/>
+            <w:vAlign w:val="center"/>
+            <w:hideMark/>
+          </w:tcPr>
+          <w:p>
+            <w:pPr>
+              <w:rPr>
+                <w:sz w:val="22"/>
+                <w:szCs w:val="22"/>
+              </w:rPr>
+            </w:pPr>
+            <w:r>
+              <w:rPr>
+                <w:sz w:val="22"/>
+                <w:szCs w:val="22"/>
+              </w:rPr>
+              <w:t xml:space="preserve">Full </w:t>
+            </w:r>
+            <w:proofErr w:type="spellStart"/>
+            <w:r>
+              <w:rPr>
+                <w:sz w:val="22"/>
+                <w:szCs w:val="22"/>
+              </w:rPr>
+              <w:t>application</w:t>
+            </w:r>
+            <w:proofErr w:type="spellEnd"/>
+            <w:r>
+              <w:rPr>
+                <w:sz w:val="22"/>
+                <w:szCs w:val="22"/>
+              </w:rPr>
+              <w:t xml:space="preserve"> </w:t>
+            </w:r>
+            <w:proofErr w:type="spellStart"/>
+            <w:r>
+              <w:rPr>
+                <w:sz w:val="22"/>
+                <w:szCs w:val="22"/>
+              </w:rPr>
+              <w:t>tests</w:t>
+            </w:r>
+            <w:proofErr w:type="spellEnd"/>
+          </w:p>
+        </w:tc>
+        <w:tc>
+          <w:tcPr>
+            <w:tcW w:w="0" w:type="auto"/>
+            <w:vAlign w:val="center"/>
+            <w:hideMark/>
+          </w:tcPr>
+          <w:p>
+            <w:pPr>
+              <w:rPr>
+                <w:sz w:val="22"/>
+                <w:szCs w:val="22"/>
+              </w:rPr>
+            </w:pPr>
+            <w:r>
+              <w:rPr>
+                <w:b/>
+                <w:bCs/>
+                <w:sz w:val="22"/>
+                <w:szCs w:val="22"/>
+              </w:rPr>
+              <w:t>MySQL</w:t>
+            </w:r>
+          </w:p>
+        </w:tc>
+        <w:tc>
+          <w:tcPr>
+            <w:tcW w:w="0" w:type="auto"/>
+            <w:vAlign w:val="center"/>
+            <w:hideMark/>
+          </w:tcPr>
+          <w:p>
+            <w:pPr>
+              <w:rPr>
+                <w:sz w:val="22"/>
+                <w:szCs w:val="22"/>
+                <w:lang w:val="en-GB"/>
+              </w:rPr>
+            </w:pPr>
+            <w:r>
+              <w:rPr>
+                <w:sz w:val="22"/>
+                <w:szCs w:val="22"/>
+                <w:lang w:val="en-GB"/>
+              </w:rPr>
+              <w:t>Verify the real application context</w:t>
+            </w:r>
+          </w:p>
+        </w:tc>
+      </w:tr>
+      <w:tr>
+        <w:trPr>
+          <w:tblCellSpacing w:w="15" w:type="dxa"/>
+        </w:trPr>
+        <w:tc>
+          <w:tcPr>
+            <w:tcW w:w="0" w:type="auto"/>
+            <w:vAlign w:val="center"/>
+            <w:hideMark/>
+          </w:tcPr>
+          <w:p>
+            <w:pPr>
+              <w:rPr>
+                <w:sz w:val="22"/>
+                <w:szCs w:val="22"/>
+              </w:rPr>
+            </w:pPr>
+            <w:r>
+              <w:rPr>
+                <w:sz w:val="22"/>
+                <w:szCs w:val="22"/>
+              </w:rPr>
+              <w:t xml:space="preserve">Developer </w:t>
+            </w:r>
+            <w:proofErr w:type="spellStart"/>
+            <w:r>
+              <w:rPr>
+                <w:sz w:val="22"/>
+                <w:szCs w:val="22"/>
+              </w:rPr>
+              <w:t>local</w:t>
+            </w:r>
+            <w:proofErr w:type="spellEnd"/>
+            <w:r>
+              <w:rPr>
+                <w:sz w:val="22"/>
+                <w:szCs w:val="22"/>
+              </w:rPr>
+              <w:t xml:space="preserve"> </w:t>
+            </w:r>
+            <w:proofErr w:type="spellStart"/>
+            <w:r>
+              <w:rPr>
+                <w:sz w:val="22"/>
+                <w:szCs w:val="22"/>
+              </w:rPr>
+              <w:t>tests</w:t>
+            </w:r>
+            <w:proofErr w:type="spellEnd"/>
+          </w:p>
+        </w:tc>
+        <w:tc>
+          <w:tcPr>
+            <w:tcW w:w="0" w:type="auto"/>
+            <w:vAlign w:val="center"/>
+            <w:hideMark/>
+          </w:tcPr>
+          <w:p>
+            <w:pPr>
+              <w:rPr>
+                <w:sz w:val="22"/>
+                <w:szCs w:val="22"/>
+              </w:rPr>
+            </w:pPr>
+            <w:r>
+              <w:rPr>
+                <w:sz w:val="22"/>
+                <w:szCs w:val="22"/>
+              </w:rPr>
+              <w:t xml:space="preserve">MySQL in </w:t>
+            </w:r>
+            <w:r>
+              <w:rPr>
+                <w:b/>
+                <w:bCs/>
+                <w:sz w:val="22"/>
+                <w:szCs w:val="22"/>
+              </w:rPr>
+              <w:t>Docker/Testcontainers</w:t>
+            </w:r>
+          </w:p>
+        </w:tc>
+        <w:tc>
+          <w:tcPr>
+            <w:tcW w:w="0" w:type="auto"/>
+            <w:vAlign w:val="center"/>
+            <w:hideMark/>
+          </w:tcPr>
+          <w:p>
+            <w:pPr>
+              <w:rPr>
+                <w:sz w:val="22"/>
+                <w:szCs w:val="22"/>
+              </w:rPr>
+            </w:pPr>
+            <w:proofErr w:type="spellStart"/>
+            <w:r>
+              <w:rPr>
+                <w:sz w:val="22"/>
+                <w:szCs w:val="22"/>
+              </w:rPr>
+              <w:t>Reproducible</w:t>
+            </w:r>
+            <w:proofErr w:type="spellEnd"/>
+            <w:r>
+              <w:rPr>
+                <w:sz w:val="22"/>
+                <w:szCs w:val="22"/>
+              </w:rPr>
+              <w:t xml:space="preserve"> </w:t>
+            </w:r>
+            <w:proofErr w:type="spellStart"/>
+            <w:r>
+              <w:rPr>
+                <w:sz w:val="22"/>
+                <w:szCs w:val="22"/>
+              </w:rPr>
+              <w:t>environment</w:t>
+            </w:r>
+            <w:proofErr w:type="spellEnd"/>
+          </w:p>
+        </w:tc>
+      </w:tr>
+      <w:tr>
+        <w:trPr>
+          <w:tblCellSpacing w:w="15" w:type="dxa"/>
+        </w:trPr>
+        <w:tc>
+          <w:tcPr>
+            <w:tcW w:w="0" w:type="auto"/>
+            <w:vAlign w:val="center"/>
+            <w:hideMark/>
+          </w:tcPr>
+          <w:p>
+            <w:pPr>
+              <w:rPr>
+                <w:sz w:val="22"/>
+                <w:szCs w:val="22"/>
+              </w:rPr>
+            </w:pPr>
+            <w:proofErr w:type="spellStart"/>
+            <w:r>
+              <w:rPr>
+                <w:sz w:val="22"/>
+                <w:szCs w:val="22"/>
+              </w:rPr>
+              <w:t>Production</w:t>
+            </w:r>
+            <w:proofErr w:type="spellEnd"/>
+          </w:p>
+        </w:tc>
+        <w:tc>
+          <w:tcPr>
+            <w:tcW w:w="0" w:type="auto"/>
+            <w:vAlign w:val="center"/>
+            <w:hideMark/>
+          </w:tcPr>
+          <w:p>
+            <w:pPr>
+              <w:rPr>
+                <w:sz w:val="22"/>
+                <w:szCs w:val="22"/>
+              </w:rPr>
+            </w:pPr>
+            <w:r>
+              <w:rPr>
+                <w:b/>
+                <w:bCs/>
+                <w:sz w:val="22"/>
+                <w:szCs w:val="22"/>
+              </w:rPr>
+              <w:t>MySQL</w:t>
+            </w:r>
+          </w:p>
+        </w:tc>
+        <w:tc>
+          <w:tcPr>
+            <w:tcW w:w="0" w:type="auto"/>
+            <w:vAlign w:val="center"/>
+            <w:hideMark/>
+          </w:tcPr>
+          <w:p>
+            <w:pPr>
+              <w:rPr>
+                <w:sz w:val="22"/>
+                <w:szCs w:val="22"/>
+                <w:lang w:val="en-GB"/>
+              </w:rPr>
+            </w:pPr>
+            <w:r>
+              <w:rPr>
+                <w:sz w:val="22"/>
+                <w:szCs w:val="22"/>
+                <w:lang w:val="en-GB"/>
+              </w:rPr>
+              <w:t>Same DB technology as tested</w:t>
+            </w:r>
+          </w:p>
+        </w:tc>
+      </w:tr>
+    </w:tbl>
+    <w:p>
+      <w:pPr>
+        <w:rPr>
+          <w:sz w:val="22"/>
+          <w:szCs w:val="22"/>
+          <w:lang w:val="en-GB"/>
+        </w:rPr>
+      </w:pPr>
+    </w:p>
+    <w:p>
+      <w:pPr>
+        <w:rPr>
+          <w:sz w:val="22"/>
+          <w:szCs w:val="22"/>
+          <w:lang w:val="en-GB"/>
+        </w:rPr>
+      </w:pPr>
+    </w:p>
+    <w:p>
+      <w:pPr>
+        <w:rPr>
+          <w:sz w:val="22"/>
+          <w:szCs w:val="22"/>
+          <w:lang w:val="en-GB"/>
+        </w:rPr>
+      </w:pPr>
+    </w:p>
+    <w:p>
+      <w:pPr>
+        <w:rPr>
+          <w:sz w:val="22"/>
+          <w:szCs w:val="22"/>
+          <w:lang w:val="en-GB"/>
+        </w:rPr>
+      </w:pPr>
+    </w:p>
+    <w:p>
+      <w:pPr>
+        <w:rPr>
+          <w:sz w:val="22"/>
+          <w:szCs w:val="22"/>
+          <w:lang w:val="en-GB"/>
+        </w:rPr>
+      </w:pPr>
+    </w:p>
+    <w:p>
+      <w:pPr>
+        <w:rPr>
+          <w:sz w:val="22"/>
+          <w:szCs w:val="22"/>
+          <w:lang w:val="en-GB"/>
+        </w:rPr>
+      </w:pPr>
+    </w:p>
+    <w:p>
+      <w:pPr>
+        <w:rPr>
+          <w:sz w:val="22"/>
+          <w:szCs w:val="22"/>
+          <w:lang w:val="en-GB"/>
+        </w:rPr>
+      </w:pPr>
+      <w:r>
+        <w:rPr>
+          <w:sz w:val="22"/>
+          <w:szCs w:val="22"/>
+          <w:lang w:val="en-GB"/>
+        </w:rPr>
+        <w:lastRenderedPageBreak/>
+        <w:drawing>
+          <wp:inline distT="0" distB="0" distL="0" distR="0" wp14:anchorId="3BCDF37B" wp14:editId="67027F69">
+            <wp:extent cx="4663844" cy="4968671"/>
+            <wp:effectExtent l="0" t="0" r="3810" b="3810"/>
+            <wp:docPr id="178905892" name="Grafik 1"/>
+            <wp:cNvGraphicFramePr>
+              <a:graphicFrameLocks xmlns:a="http://schemas.openxmlformats.org/drawingml/2006/main" noChangeAspect="1"/>
+            </wp:cNvGraphicFramePr>
+            <a:graphic xmlns:a="http://schemas.openxmlformats.org/drawingml/2006/main">
+              <a:graphicData uri="http://schemas.openxmlformats.org/drawingml/2006/picture">
+                <pic:pic xmlns:pic="http://schemas.openxmlformats.org/drawingml/2006/picture">
+                  <pic:nvPicPr>
+                    <pic:cNvPr id="178905892" name=""/>
+                    <pic:cNvPicPr/>
+                  </pic:nvPicPr>
+                  <pic:blipFill>
+                    <a:blip r:embed="rId15"/>
+                    <a:stretch>
+                      <a:fillRect/>
+                    </a:stretch>
+                  </pic:blipFill>
+                  <pic:spPr>
+                    <a:xfrm>
+                      <a:off x="0" y="0"/>
+                      <a:ext cx="4663844" cy="4968671"/>
+                    </a:xfrm>
+                    <a:prstGeom prst="rect">
+                      <a:avLst/>
+                    </a:prstGeom>
+                  </pic:spPr>
+                </pic:pic>
+              </a:graphicData>
+            </a:graphic>
+          </wp:inline>
+        </w:drawing>
+      </w:r>
+    </w:p>
+    <w:p>
+      <w:pPr>
+        <w:rPr>
+          <w:sz w:val="22"/>
+          <w:szCs w:val="22"/>
+          <w:lang w:val="en-GB"/>
+        </w:rPr>
+      </w:pPr>
+    </w:p>
+    <w:p>
+      <w:pPr>
+        <w:rPr>
+          <w:sz w:val="22"/>
+          <w:szCs w:val="22"/>
+          <w:lang w:val="en-GB"/>
+        </w:rPr>
+      </w:pPr>
+    </w:p>
+    <w:p>
+      <w:pPr>
+        <w:rPr>
+          <w:sz w:val="22"/>
+          <w:szCs w:val="22"/>
+          <w:lang w:val="en-GB"/>
+        </w:rPr>
+      </w:pPr>
+    </w:p>
+    <w:p>
+      <w:pPr>
+        <w:rPr>
+          <w:sz w:val="22"/>
+          <w:szCs w:val="22"/>
+          <w:lang w:val="en-GB"/>
+        </w:rPr>
+      </w:pPr>
+      <w:r>
+        <w:rPr>
+          <w:sz w:val="22"/>
+          <w:szCs w:val="22"/>
+          <w:lang w:val="en-GB"/>
+        </w:rPr>
+        <w:drawing>
+          <wp:inline distT="0" distB="0" distL="0" distR="0" wp14:anchorId="493954F6" wp14:editId="689828D2">
+            <wp:extent cx="5760720" cy="257175"/>
+            <wp:effectExtent l="0" t="0" r="0" b="9525"/>
+            <wp:docPr id="1273266996" name="Grafik 1"/>
+            <wp:cNvGraphicFramePr>
+              <a:graphicFrameLocks xmlns:a="http://schemas.openxmlformats.org/drawingml/2006/main" noChangeAspect="1"/>
+            </wp:cNvGraphicFramePr>
+            <a:graphic xmlns:a="http://schemas.openxmlformats.org/drawingml/2006/main">
+              <a:graphicData uri="http://schemas.openxmlformats.org/drawingml/2006/picture">
+                <pic:pic xmlns:pic="http://schemas.openxmlformats.org/drawingml/2006/picture">
+                  <pic:nvPicPr>
+                    <pic:cNvPr id="1273266996" name=""/>
+                    <pic:cNvPicPr/>
+                  </pic:nvPicPr>
+                  <pic:blipFill>
+                    <a:blip r:embed="rId16"/>
+                    <a:stretch>
+                      <a:fillRect/>
+                    </a:stretch>
+                  </pic:blipFill>
+                  <pic:spPr>
+                    <a:xfrm>
+                      <a:off x="0" y="0"/>
+                      <a:ext cx="5760720" cy="257175"/>
+                    </a:xfrm>
+                    <a:prstGeom prst="rect">
+                      <a:avLst/>
+                    </a:prstGeom>
+                  </pic:spPr>
+                </pic:pic>
+              </a:graphicData>
+            </a:graphic>
+          </wp:inline>
+        </w:drawing>
+      </w:r>
     </w:p>
     <w:sectPr>
       <w:pgSz w:w="11906" w:h="16838"/>

</xml_diff>